<commit_message>
Atualiza documento de modelagem de domínio com o modelo de classes revisado
</commit_message>
<xml_diff>
--- a/docs/03-modelagem-de-dominio-e-orientacao-a-objetos.docx
+++ b/docs/03-modelagem-de-dominio-e-orientacao-a-objetos.docx
@@ -13,7 +13,7 @@
           <w:szCs w:val="24"/>
         </w:rPr>
       </w:pPr>
-      <w:bookmarkStart w:colFirst="0" w:colLast="0" w:name="_t6spa8htud3l" w:id="0"/>
+      <w:bookmarkStart w:colFirst="0" w:colLast="0" w:name="_4d089deoljxa" w:id="0"/>
       <w:bookmarkEnd w:id="0"/>
       <w:r>
         <w:rPr>
@@ -74,7 +74,7 @@
           <w:szCs w:val="24"/>
         </w:rPr>
       </w:pPr>
-      <w:bookmarkStart w:colFirst="0" w:colLast="0" w:name="_7whq0km1kvis" w:id="1"/>
+      <w:bookmarkStart w:colFirst="0" w:colLast="0" w:name="_ydwt0ewkgj8o" w:id="1"/>
       <w:bookmarkEnd w:id="1"/>
       <w:r>
         <w:rPr>
@@ -98,7 +98,7 @@
           <w:szCs w:val="24"/>
         </w:rPr>
       </w:pPr>
-      <w:bookmarkStart w:colFirst="0" w:colLast="0" w:name="_1wuj2czars3u" w:id="2"/>
+      <w:bookmarkStart w:colFirst="0" w:colLast="0" w:name="_pj92upawth9" w:id="2"/>
       <w:bookmarkEnd w:id="2"/>
       <w:r>
         <w:rPr>
@@ -137,7 +137,7 @@
           <w:szCs w:val="24"/>
         </w:rPr>
       </w:pPr>
-      <w:bookmarkStart w:colFirst="0" w:colLast="0" w:name="_gpx6vgpf2mh0" w:id="3"/>
+      <w:bookmarkStart w:colFirst="0" w:colLast="0" w:name="_57u443ef390q" w:id="3"/>
       <w:bookmarkEnd w:id="3"/>
       <w:r>
         <w:rPr>
@@ -170,14 +170,15 @@
           <w:numId w:val="4"/>
         </w:numPr>
         <w:pBdr>
-          <w:top w:color="auto" w:space="0" w:sz="0" w:val="none"/>
-          <w:bottom w:color="auto" w:space="0" w:sz="0" w:val="none"/>
-          <w:right w:color="auto" w:space="0" w:sz="0" w:val="none"/>
-          <w:between w:color="auto" w:space="0" w:sz="0" w:val="none"/>
+          <w:top w:color="000000" w:space="0" w:sz="0" w:val="none"/>
+          <w:bottom w:color="000000" w:space="0" w:sz="0" w:val="none"/>
+          <w:right w:color="000000" w:space="0" w:sz="0" w:val="none"/>
+          <w:between w:color="000000" w:space="0" w:sz="0" w:val="none"/>
         </w:pBdr>
         <w:spacing w:after="0" w:lineRule="auto"/>
         <w:ind w:left="720" w:hanging="360"/>
         <w:jc w:val="left"/>
+        <w:rPr/>
       </w:pPr>
       <w:r>
         <w:rPr>
@@ -201,14 +202,15 @@
           <w:numId w:val="4"/>
         </w:numPr>
         <w:pBdr>
-          <w:top w:color="auto" w:space="0" w:sz="0" w:val="none"/>
-          <w:bottom w:color="auto" w:space="0" w:sz="0" w:val="none"/>
-          <w:right w:color="auto" w:space="0" w:sz="0" w:val="none"/>
-          <w:between w:color="auto" w:space="0" w:sz="0" w:val="none"/>
+          <w:top w:color="000000" w:space="0" w:sz="0" w:val="none"/>
+          <w:bottom w:color="000000" w:space="0" w:sz="0" w:val="none"/>
+          <w:right w:color="000000" w:space="0" w:sz="0" w:val="none"/>
+          <w:between w:color="000000" w:space="0" w:sz="0" w:val="none"/>
         </w:pBdr>
         <w:spacing w:after="0" w:lineRule="auto"/>
         <w:ind w:left="720" w:hanging="360"/>
         <w:jc w:val="left"/>
+        <w:rPr/>
       </w:pPr>
       <w:r>
         <w:rPr>
@@ -232,14 +234,15 @@
           <w:numId w:val="4"/>
         </w:numPr>
         <w:pBdr>
-          <w:top w:color="auto" w:space="0" w:sz="0" w:val="none"/>
-          <w:bottom w:color="auto" w:space="0" w:sz="0" w:val="none"/>
-          <w:right w:color="auto" w:space="0" w:sz="0" w:val="none"/>
-          <w:between w:color="auto" w:space="0" w:sz="0" w:val="none"/>
+          <w:top w:color="000000" w:space="0" w:sz="0" w:val="none"/>
+          <w:bottom w:color="000000" w:space="0" w:sz="0" w:val="none"/>
+          <w:right w:color="000000" w:space="0" w:sz="0" w:val="none"/>
+          <w:between w:color="000000" w:space="0" w:sz="0" w:val="none"/>
         </w:pBdr>
         <w:spacing w:after="0" w:lineRule="auto"/>
         <w:ind w:left="720" w:hanging="360"/>
         <w:jc w:val="left"/>
+        <w:rPr/>
       </w:pPr>
       <w:r>
         <w:rPr>
@@ -263,14 +266,15 @@
           <w:numId w:val="4"/>
         </w:numPr>
         <w:pBdr>
-          <w:top w:color="auto" w:space="0" w:sz="0" w:val="none"/>
-          <w:bottom w:color="auto" w:space="0" w:sz="0" w:val="none"/>
-          <w:right w:color="auto" w:space="0" w:sz="0" w:val="none"/>
-          <w:between w:color="auto" w:space="0" w:sz="0" w:val="none"/>
+          <w:top w:color="000000" w:space="0" w:sz="0" w:val="none"/>
+          <w:bottom w:color="000000" w:space="0" w:sz="0" w:val="none"/>
+          <w:right w:color="000000" w:space="0" w:sz="0" w:val="none"/>
+          <w:between w:color="000000" w:space="0" w:sz="0" w:val="none"/>
         </w:pBdr>
         <w:spacing w:after="0" w:lineRule="auto"/>
         <w:ind w:left="720" w:hanging="360"/>
         <w:jc w:val="left"/>
+        <w:rPr/>
       </w:pPr>
       <w:r>
         <w:rPr>
@@ -294,14 +298,15 @@
           <w:numId w:val="4"/>
         </w:numPr>
         <w:pBdr>
-          <w:top w:color="auto" w:space="0" w:sz="0" w:val="none"/>
-          <w:bottom w:color="auto" w:space="0" w:sz="0" w:val="none"/>
-          <w:right w:color="auto" w:space="0" w:sz="0" w:val="none"/>
-          <w:between w:color="auto" w:space="0" w:sz="0" w:val="none"/>
+          <w:top w:color="000000" w:space="0" w:sz="0" w:val="none"/>
+          <w:bottom w:color="000000" w:space="0" w:sz="0" w:val="none"/>
+          <w:right w:color="000000" w:space="0" w:sz="0" w:val="none"/>
+          <w:between w:color="000000" w:space="0" w:sz="0" w:val="none"/>
         </w:pBdr>
         <w:spacing w:after="0" w:lineRule="auto"/>
         <w:ind w:left="720" w:hanging="360"/>
         <w:jc w:val="left"/>
+        <w:rPr/>
       </w:pPr>
       <w:r>
         <w:rPr>
@@ -331,7 +336,7 @@
           <w:szCs w:val="24"/>
         </w:rPr>
       </w:pPr>
-      <w:bookmarkStart w:colFirst="0" w:colLast="0" w:name="_kifxlhlsf855" w:id="4"/>
+      <w:bookmarkStart w:colFirst="0" w:colLast="0" w:name="_bnnspdev2qsr" w:id="4"/>
       <w:bookmarkEnd w:id="4"/>
       <w:r>
         <w:rPr>
@@ -354,13 +359,7 @@
         <w:rPr>
           <w:rtl w:val="0"/>
         </w:rPr>
-        <w:t xml:space="preserve">O Quadro 1 reúne</w:t>
-      </w:r>
-      <w:r>
-        <w:rPr>
-          <w:rtl w:val="0"/>
-        </w:rPr>
-        <w:t xml:space="preserve"> os conceitos identificados a partir das funcionalidades do Nexo.</w:t>
+        <w:t xml:space="preserve">O Quadro 1 reúne os conceitos identificados a partir das funcionalidades do Nexo.</w:t>
       </w:r>
     </w:p>
     <w:p>
@@ -4106,6 +4105,594 @@
           </w:p>
         </w:tc>
       </w:tr>
+      <w:tr>
+        <w:trPr>
+          <w:cantSplit w:val="0"/>
+          <w:trHeight w:val="540" w:hRule="atLeast"/>
+          <w:tblHeader w:val="0"/>
+        </w:trPr>
+        <w:tc>
+          <w:tcPr>
+            <w:tcBorders>
+              <w:top w:color="000000" w:space="0" w:sz="6" w:val="single"/>
+              <w:left w:color="000000" w:space="0" w:sz="6" w:val="single"/>
+              <w:bottom w:color="000000" w:space="0" w:sz="6" w:val="single"/>
+              <w:right w:color="000000" w:space="0" w:sz="6" w:val="single"/>
+            </w:tcBorders>
+            <w:tcMar>
+              <w:top w:w="60.0" w:type="dxa"/>
+              <w:left w:w="80.0" w:type="dxa"/>
+              <w:bottom w:w="60.0" w:type="dxa"/>
+              <w:right w:w="80.0" w:type="dxa"/>
+            </w:tcMar>
+            <w:vAlign w:val="top"/>
+          </w:tcPr>
+          <w:p>
+            <w:pPr>
+              <w:spacing w:after="0" w:line="240" w:lineRule="auto"/>
+              <w:jc w:val="left"/>
+              <w:rPr>
+                <w:sz w:val="20"/>
+                <w:szCs w:val="20"/>
+              </w:rPr>
+            </w:pPr>
+            <w:r>
+              <w:rPr>
+                <w:sz w:val="20"/>
+                <w:szCs w:val="20"/>
+                <w:rtl w:val="0"/>
+              </w:rPr>
+              <w:t xml:space="preserve">25</w:t>
+            </w:r>
+          </w:p>
+        </w:tc>
+        <w:tc>
+          <w:tcPr>
+            <w:tcBorders>
+              <w:top w:color="000000" w:space="0" w:sz="6" w:val="single"/>
+              <w:left w:color="000000" w:space="0" w:sz="6" w:val="single"/>
+              <w:bottom w:color="000000" w:space="0" w:sz="6" w:val="single"/>
+              <w:right w:color="000000" w:space="0" w:sz="6" w:val="single"/>
+            </w:tcBorders>
+            <w:tcMar>
+              <w:top w:w="60.0" w:type="dxa"/>
+              <w:left w:w="80.0" w:type="dxa"/>
+              <w:bottom w:w="60.0" w:type="dxa"/>
+              <w:right w:w="80.0" w:type="dxa"/>
+            </w:tcMar>
+            <w:vAlign w:val="top"/>
+          </w:tcPr>
+          <w:p>
+            <w:pPr>
+              <w:spacing w:after="0" w:line="240" w:lineRule="auto"/>
+              <w:jc w:val="left"/>
+              <w:rPr>
+                <w:sz w:val="20"/>
+                <w:szCs w:val="20"/>
+              </w:rPr>
+            </w:pPr>
+            <w:r>
+              <w:rPr>
+                <w:sz w:val="20"/>
+                <w:szCs w:val="20"/>
+                <w:rtl w:val="0"/>
+              </w:rPr>
+              <w:t xml:space="preserve">Área de Atuação</w:t>
+            </w:r>
+          </w:p>
+        </w:tc>
+        <w:tc>
+          <w:tcPr>
+            <w:tcBorders>
+              <w:top w:color="000000" w:space="0" w:sz="6" w:val="single"/>
+              <w:left w:color="000000" w:space="0" w:sz="6" w:val="single"/>
+              <w:bottom w:color="000000" w:space="0" w:sz="6" w:val="single"/>
+              <w:right w:color="000000" w:space="0" w:sz="6" w:val="single"/>
+            </w:tcBorders>
+            <w:tcMar>
+              <w:top w:w="60.0" w:type="dxa"/>
+              <w:left w:w="80.0" w:type="dxa"/>
+              <w:bottom w:w="60.0" w:type="dxa"/>
+              <w:right w:w="80.0" w:type="dxa"/>
+            </w:tcMar>
+            <w:vAlign w:val="top"/>
+          </w:tcPr>
+          <w:p>
+            <w:pPr>
+              <w:spacing w:after="0" w:line="240" w:lineRule="auto"/>
+              <w:jc w:val="left"/>
+              <w:rPr>
+                <w:sz w:val="20"/>
+                <w:szCs w:val="20"/>
+              </w:rPr>
+            </w:pPr>
+            <w:r>
+              <w:rPr>
+                <w:sz w:val="20"/>
+                <w:szCs w:val="20"/>
+                <w:rtl w:val="0"/>
+              </w:rPr>
+              <w:t xml:space="preserve">Área da Psicologia em que o profissional atua (clínica, organizacional, escolar etc.), escolhida de um catálogo fixo.</w:t>
+            </w:r>
+          </w:p>
+        </w:tc>
+        <w:tc>
+          <w:tcPr>
+            <w:tcBorders>
+              <w:top w:color="000000" w:space="0" w:sz="6" w:val="single"/>
+              <w:left w:color="000000" w:space="0" w:sz="6" w:val="single"/>
+              <w:bottom w:color="000000" w:space="0" w:sz="6" w:val="single"/>
+              <w:right w:color="000000" w:space="0" w:sz="6" w:val="single"/>
+            </w:tcBorders>
+            <w:tcMar>
+              <w:top w:w="60.0" w:type="dxa"/>
+              <w:left w:w="80.0" w:type="dxa"/>
+              <w:bottom w:w="60.0" w:type="dxa"/>
+              <w:right w:w="80.0" w:type="dxa"/>
+            </w:tcMar>
+            <w:vAlign w:val="top"/>
+          </w:tcPr>
+          <w:p>
+            <w:pPr>
+              <w:spacing w:after="0" w:line="240" w:lineRule="auto"/>
+              <w:jc w:val="left"/>
+              <w:rPr>
+                <w:sz w:val="20"/>
+                <w:szCs w:val="20"/>
+              </w:rPr>
+            </w:pPr>
+            <w:r>
+              <w:rPr>
+                <w:sz w:val="20"/>
+                <w:szCs w:val="20"/>
+                <w:rtl w:val="0"/>
+              </w:rPr>
+              <w:t xml:space="preserve">UC-022; RF-033, RN-023</w:t>
+            </w:r>
+          </w:p>
+        </w:tc>
+      </w:tr>
+      <w:tr>
+        <w:trPr>
+          <w:cantSplit w:val="0"/>
+          <w:trHeight w:val="540" w:hRule="atLeast"/>
+          <w:tblHeader w:val="0"/>
+        </w:trPr>
+        <w:tc>
+          <w:tcPr>
+            <w:tcBorders>
+              <w:top w:color="000000" w:space="0" w:sz="6" w:val="single"/>
+              <w:left w:color="000000" w:space="0" w:sz="6" w:val="single"/>
+              <w:bottom w:color="000000" w:space="0" w:sz="6" w:val="single"/>
+              <w:right w:color="000000" w:space="0" w:sz="6" w:val="single"/>
+            </w:tcBorders>
+            <w:tcMar>
+              <w:top w:w="60.0" w:type="dxa"/>
+              <w:left w:w="80.0" w:type="dxa"/>
+              <w:bottom w:w="60.0" w:type="dxa"/>
+              <w:right w:w="80.0" w:type="dxa"/>
+            </w:tcMar>
+            <w:vAlign w:val="top"/>
+          </w:tcPr>
+          <w:p>
+            <w:pPr>
+              <w:spacing w:after="0" w:line="240" w:lineRule="auto"/>
+              <w:jc w:val="left"/>
+              <w:rPr>
+                <w:sz w:val="20"/>
+                <w:szCs w:val="20"/>
+              </w:rPr>
+            </w:pPr>
+            <w:r>
+              <w:rPr>
+                <w:sz w:val="20"/>
+                <w:szCs w:val="20"/>
+                <w:rtl w:val="0"/>
+              </w:rPr>
+              <w:t xml:space="preserve">26</w:t>
+            </w:r>
+          </w:p>
+        </w:tc>
+        <w:tc>
+          <w:tcPr>
+            <w:tcBorders>
+              <w:top w:color="000000" w:space="0" w:sz="6" w:val="single"/>
+              <w:left w:color="000000" w:space="0" w:sz="6" w:val="single"/>
+              <w:bottom w:color="000000" w:space="0" w:sz="6" w:val="single"/>
+              <w:right w:color="000000" w:space="0" w:sz="6" w:val="single"/>
+            </w:tcBorders>
+            <w:tcMar>
+              <w:top w:w="60.0" w:type="dxa"/>
+              <w:left w:w="80.0" w:type="dxa"/>
+              <w:bottom w:w="60.0" w:type="dxa"/>
+              <w:right w:w="80.0" w:type="dxa"/>
+            </w:tcMar>
+            <w:vAlign w:val="top"/>
+          </w:tcPr>
+          <w:p>
+            <w:pPr>
+              <w:spacing w:after="0" w:line="240" w:lineRule="auto"/>
+              <w:jc w:val="left"/>
+              <w:rPr>
+                <w:sz w:val="20"/>
+                <w:szCs w:val="20"/>
+              </w:rPr>
+            </w:pPr>
+            <w:r>
+              <w:rPr>
+                <w:sz w:val="20"/>
+                <w:szCs w:val="20"/>
+                <w:rtl w:val="0"/>
+              </w:rPr>
+              <w:t xml:space="preserve">Versão da Evolução</w:t>
+            </w:r>
+          </w:p>
+        </w:tc>
+        <w:tc>
+          <w:tcPr>
+            <w:tcBorders>
+              <w:top w:color="000000" w:space="0" w:sz="6" w:val="single"/>
+              <w:left w:color="000000" w:space="0" w:sz="6" w:val="single"/>
+              <w:bottom w:color="000000" w:space="0" w:sz="6" w:val="single"/>
+              <w:right w:color="000000" w:space="0" w:sz="6" w:val="single"/>
+            </w:tcBorders>
+            <w:tcMar>
+              <w:top w:w="60.0" w:type="dxa"/>
+              <w:left w:w="80.0" w:type="dxa"/>
+              <w:bottom w:w="60.0" w:type="dxa"/>
+              <w:right w:w="80.0" w:type="dxa"/>
+            </w:tcMar>
+            <w:vAlign w:val="top"/>
+          </w:tcPr>
+          <w:p>
+            <w:pPr>
+              <w:spacing w:after="0" w:line="240" w:lineRule="auto"/>
+              <w:jc w:val="left"/>
+              <w:rPr>
+                <w:sz w:val="20"/>
+                <w:szCs w:val="20"/>
+              </w:rPr>
+            </w:pPr>
+            <w:r>
+              <w:rPr>
+                <w:sz w:val="20"/>
+                <w:szCs w:val="20"/>
+                <w:rtl w:val="0"/>
+              </w:rPr>
+              <w:t xml:space="preserve">Conteúdo de uma Evolução Clínica em um momento; cada revisão gera uma nova versão.</w:t>
+            </w:r>
+          </w:p>
+        </w:tc>
+        <w:tc>
+          <w:tcPr>
+            <w:tcBorders>
+              <w:top w:color="000000" w:space="0" w:sz="6" w:val="single"/>
+              <w:left w:color="000000" w:space="0" w:sz="6" w:val="single"/>
+              <w:bottom w:color="000000" w:space="0" w:sz="6" w:val="single"/>
+              <w:right w:color="000000" w:space="0" w:sz="6" w:val="single"/>
+            </w:tcBorders>
+            <w:tcMar>
+              <w:top w:w="60.0" w:type="dxa"/>
+              <w:left w:w="80.0" w:type="dxa"/>
+              <w:bottom w:w="60.0" w:type="dxa"/>
+              <w:right w:w="80.0" w:type="dxa"/>
+            </w:tcMar>
+            <w:vAlign w:val="top"/>
+          </w:tcPr>
+          <w:p>
+            <w:pPr>
+              <w:spacing w:after="0" w:line="240" w:lineRule="auto"/>
+              <w:jc w:val="left"/>
+              <w:rPr>
+                <w:sz w:val="20"/>
+                <w:szCs w:val="20"/>
+              </w:rPr>
+            </w:pPr>
+            <w:r>
+              <w:rPr>
+                <w:sz w:val="20"/>
+                <w:szCs w:val="20"/>
+                <w:rtl w:val="0"/>
+              </w:rPr>
+              <w:t xml:space="preserve">UC-034; RF-040, RN-028</w:t>
+            </w:r>
+          </w:p>
+        </w:tc>
+      </w:tr>
+      <w:tr>
+        <w:trPr>
+          <w:cantSplit w:val="0"/>
+          <w:trHeight w:val="540" w:hRule="atLeast"/>
+          <w:tblHeader w:val="0"/>
+        </w:trPr>
+        <w:tc>
+          <w:tcPr>
+            <w:tcBorders>
+              <w:top w:color="000000" w:space="0" w:sz="6" w:val="single"/>
+              <w:left w:color="000000" w:space="0" w:sz="6" w:val="single"/>
+              <w:bottom w:color="000000" w:space="0" w:sz="6" w:val="single"/>
+              <w:right w:color="000000" w:space="0" w:sz="6" w:val="single"/>
+            </w:tcBorders>
+            <w:tcMar>
+              <w:top w:w="60.0" w:type="dxa"/>
+              <w:left w:w="80.0" w:type="dxa"/>
+              <w:bottom w:w="60.0" w:type="dxa"/>
+              <w:right w:w="80.0" w:type="dxa"/>
+            </w:tcMar>
+            <w:vAlign w:val="top"/>
+          </w:tcPr>
+          <w:p>
+            <w:pPr>
+              <w:spacing w:after="0" w:line="240" w:lineRule="auto"/>
+              <w:jc w:val="left"/>
+              <w:rPr>
+                <w:sz w:val="20"/>
+                <w:szCs w:val="20"/>
+              </w:rPr>
+            </w:pPr>
+            <w:r>
+              <w:rPr>
+                <w:sz w:val="20"/>
+                <w:szCs w:val="20"/>
+                <w:rtl w:val="0"/>
+              </w:rPr>
+              <w:t xml:space="preserve">27</w:t>
+            </w:r>
+          </w:p>
+        </w:tc>
+        <w:tc>
+          <w:tcPr>
+            <w:tcBorders>
+              <w:top w:color="000000" w:space="0" w:sz="6" w:val="single"/>
+              <w:left w:color="000000" w:space="0" w:sz="6" w:val="single"/>
+              <w:bottom w:color="000000" w:space="0" w:sz="6" w:val="single"/>
+              <w:right w:color="000000" w:space="0" w:sz="6" w:val="single"/>
+            </w:tcBorders>
+            <w:tcMar>
+              <w:top w:w="60.0" w:type="dxa"/>
+              <w:left w:w="80.0" w:type="dxa"/>
+              <w:bottom w:w="60.0" w:type="dxa"/>
+              <w:right w:w="80.0" w:type="dxa"/>
+            </w:tcMar>
+            <w:vAlign w:val="top"/>
+          </w:tcPr>
+          <w:p>
+            <w:pPr>
+              <w:spacing w:after="0" w:line="240" w:lineRule="auto"/>
+              <w:jc w:val="left"/>
+              <w:rPr>
+                <w:sz w:val="20"/>
+                <w:szCs w:val="20"/>
+              </w:rPr>
+            </w:pPr>
+            <w:r>
+              <w:rPr>
+                <w:sz w:val="20"/>
+                <w:szCs w:val="20"/>
+                <w:rtl w:val="0"/>
+              </w:rPr>
+              <w:t xml:space="preserve">Cobrança Avulsa</w:t>
+            </w:r>
+          </w:p>
+        </w:tc>
+        <w:tc>
+          <w:tcPr>
+            <w:tcBorders>
+              <w:top w:color="000000" w:space="0" w:sz="6" w:val="single"/>
+              <w:left w:color="000000" w:space="0" w:sz="6" w:val="single"/>
+              <w:bottom w:color="000000" w:space="0" w:sz="6" w:val="single"/>
+              <w:right w:color="000000" w:space="0" w:sz="6" w:val="single"/>
+            </w:tcBorders>
+            <w:tcMar>
+              <w:top w:w="60.0" w:type="dxa"/>
+              <w:left w:w="80.0" w:type="dxa"/>
+              <w:bottom w:w="60.0" w:type="dxa"/>
+              <w:right w:w="80.0" w:type="dxa"/>
+            </w:tcMar>
+            <w:vAlign w:val="top"/>
+          </w:tcPr>
+          <w:p>
+            <w:pPr>
+              <w:spacing w:after="0" w:line="240" w:lineRule="auto"/>
+              <w:jc w:val="left"/>
+              <w:rPr>
+                <w:sz w:val="20"/>
+                <w:szCs w:val="20"/>
+              </w:rPr>
+            </w:pPr>
+            <w:r>
+              <w:rPr>
+                <w:sz w:val="20"/>
+                <w:szCs w:val="20"/>
+                <w:rtl w:val="0"/>
+              </w:rPr>
+              <w:t xml:space="preserve">Cobrança referente a uma consulta específica.</w:t>
+            </w:r>
+          </w:p>
+        </w:tc>
+        <w:tc>
+          <w:tcPr>
+            <w:tcBorders>
+              <w:top w:color="000000" w:space="0" w:sz="6" w:val="single"/>
+              <w:left w:color="000000" w:space="0" w:sz="6" w:val="single"/>
+              <w:bottom w:color="000000" w:space="0" w:sz="6" w:val="single"/>
+              <w:right w:color="000000" w:space="0" w:sz="6" w:val="single"/>
+            </w:tcBorders>
+            <w:tcMar>
+              <w:top w:w="60.0" w:type="dxa"/>
+              <w:left w:w="80.0" w:type="dxa"/>
+              <w:bottom w:w="60.0" w:type="dxa"/>
+              <w:right w:w="80.0" w:type="dxa"/>
+            </w:tcMar>
+            <w:vAlign w:val="top"/>
+          </w:tcPr>
+          <w:p>
+            <w:pPr>
+              <w:spacing w:after="0" w:line="240" w:lineRule="auto"/>
+              <w:jc w:val="left"/>
+              <w:rPr>
+                <w:sz w:val="20"/>
+                <w:szCs w:val="20"/>
+              </w:rPr>
+            </w:pPr>
+            <w:r>
+              <w:rPr>
+                <w:sz w:val="20"/>
+                <w:szCs w:val="20"/>
+                <w:rtl w:val="0"/>
+              </w:rPr>
+              <w:t xml:space="preserve">UC-041; RN-054</w:t>
+            </w:r>
+          </w:p>
+        </w:tc>
+      </w:tr>
+      <w:tr>
+        <w:trPr>
+          <w:cantSplit w:val="0"/>
+          <w:trHeight w:val="540" w:hRule="atLeast"/>
+          <w:tblHeader w:val="0"/>
+        </w:trPr>
+        <w:tc>
+          <w:tcPr>
+            <w:tcBorders>
+              <w:top w:color="000000" w:space="0" w:sz="6" w:val="single"/>
+              <w:left w:color="000000" w:space="0" w:sz="6" w:val="single"/>
+              <w:bottom w:color="000000" w:space="0" w:sz="6" w:val="single"/>
+              <w:right w:color="000000" w:space="0" w:sz="6" w:val="single"/>
+            </w:tcBorders>
+            <w:tcMar>
+              <w:top w:w="60.0" w:type="dxa"/>
+              <w:left w:w="80.0" w:type="dxa"/>
+              <w:bottom w:w="60.0" w:type="dxa"/>
+              <w:right w:w="80.0" w:type="dxa"/>
+            </w:tcMar>
+            <w:vAlign w:val="top"/>
+          </w:tcPr>
+          <w:p>
+            <w:pPr>
+              <w:spacing w:after="0" w:line="240" w:lineRule="auto"/>
+              <w:jc w:val="left"/>
+              <w:rPr>
+                <w:sz w:val="20"/>
+                <w:szCs w:val="20"/>
+              </w:rPr>
+            </w:pPr>
+            <w:r>
+              <w:rPr>
+                <w:sz w:val="20"/>
+                <w:szCs w:val="20"/>
+                <w:rtl w:val="0"/>
+              </w:rPr>
+              <w:t xml:space="preserve">28</w:t>
+            </w:r>
+          </w:p>
+        </w:tc>
+        <w:tc>
+          <w:tcPr>
+            <w:tcBorders>
+              <w:top w:color="000000" w:space="0" w:sz="6" w:val="single"/>
+              <w:left w:color="000000" w:space="0" w:sz="6" w:val="single"/>
+              <w:bottom w:color="000000" w:space="0" w:sz="6" w:val="single"/>
+              <w:right w:color="000000" w:space="0" w:sz="6" w:val="single"/>
+            </w:tcBorders>
+            <w:tcMar>
+              <w:top w:w="60.0" w:type="dxa"/>
+              <w:left w:w="80.0" w:type="dxa"/>
+              <w:bottom w:w="60.0" w:type="dxa"/>
+              <w:right w:w="80.0" w:type="dxa"/>
+            </w:tcMar>
+            <w:vAlign w:val="top"/>
+          </w:tcPr>
+          <w:p>
+            <w:pPr>
+              <w:spacing w:after="0" w:line="240" w:lineRule="auto"/>
+              <w:jc w:val="left"/>
+              <w:rPr>
+                <w:sz w:val="20"/>
+                <w:szCs w:val="20"/>
+              </w:rPr>
+            </w:pPr>
+            <w:r>
+              <w:rPr>
+                <w:sz w:val="20"/>
+                <w:szCs w:val="20"/>
+                <w:rtl w:val="0"/>
+              </w:rPr>
+              <w:t xml:space="preserve">Mensalidade</w:t>
+            </w:r>
+          </w:p>
+        </w:tc>
+        <w:tc>
+          <w:tcPr>
+            <w:tcBorders>
+              <w:top w:color="000000" w:space="0" w:sz="6" w:val="single"/>
+              <w:left w:color="000000" w:space="0" w:sz="6" w:val="single"/>
+              <w:bottom w:color="000000" w:space="0" w:sz="6" w:val="single"/>
+              <w:right w:color="000000" w:space="0" w:sz="6" w:val="single"/>
+            </w:tcBorders>
+            <w:tcMar>
+              <w:top w:w="60.0" w:type="dxa"/>
+              <w:left w:w="80.0" w:type="dxa"/>
+              <w:bottom w:w="60.0" w:type="dxa"/>
+              <w:right w:w="80.0" w:type="dxa"/>
+            </w:tcMar>
+            <w:vAlign w:val="top"/>
+          </w:tcPr>
+          <w:p>
+            <w:pPr>
+              <w:spacing w:after="0" w:line="240" w:lineRule="auto"/>
+              <w:jc w:val="left"/>
+              <w:rPr>
+                <w:sz w:val="20"/>
+                <w:szCs w:val="20"/>
+              </w:rPr>
+            </w:pPr>
+            <w:r>
+              <w:rPr>
+                <w:sz w:val="20"/>
+                <w:szCs w:val="20"/>
+                <w:rtl w:val="0"/>
+              </w:rPr>
+              <w:t xml:space="preserve">Cobrança de valor fixo vinculada a uma recorrência de atendimento.</w:t>
+            </w:r>
+          </w:p>
+        </w:tc>
+        <w:tc>
+          <w:tcPr>
+            <w:tcBorders>
+              <w:top w:color="000000" w:space="0" w:sz="6" w:val="single"/>
+              <w:left w:color="000000" w:space="0" w:sz="6" w:val="single"/>
+              <w:bottom w:color="000000" w:space="0" w:sz="6" w:val="single"/>
+              <w:right w:color="000000" w:space="0" w:sz="6" w:val="single"/>
+            </w:tcBorders>
+            <w:tcMar>
+              <w:top w:w="60.0" w:type="dxa"/>
+              <w:left w:w="80.0" w:type="dxa"/>
+              <w:bottom w:w="60.0" w:type="dxa"/>
+              <w:right w:w="80.0" w:type="dxa"/>
+            </w:tcMar>
+            <w:vAlign w:val="top"/>
+          </w:tcPr>
+          <w:p>
+            <w:pPr>
+              <w:spacing w:after="0" w:line="240" w:lineRule="auto"/>
+              <w:jc w:val="left"/>
+              <w:rPr>
+                <w:sz w:val="20"/>
+                <w:szCs w:val="20"/>
+              </w:rPr>
+            </w:pPr>
+            <w:r>
+              <w:rPr>
+                <w:sz w:val="20"/>
+                <w:szCs w:val="20"/>
+                <w:rtl w:val="0"/>
+              </w:rPr>
+              <w:t xml:space="preserve">UC-041; RN-055</w:t>
+            </w:r>
+          </w:p>
+        </w:tc>
+      </w:tr>
     </w:tbl>
     <w:p>
       <w:pPr>
@@ -4159,7 +4746,7 @@
           <w:szCs w:val="24"/>
         </w:rPr>
       </w:pPr>
-      <w:bookmarkStart w:colFirst="0" w:colLast="0" w:name="_b5xbbxyq4gvp" w:id="5"/>
+      <w:bookmarkStart w:colFirst="0" w:colLast="0" w:name="_n8nfgcz3zl6i" w:id="5"/>
       <w:bookmarkEnd w:id="5"/>
       <w:r>
         <w:rPr>
@@ -4196,7 +4783,7 @@
           <w:szCs w:val="24"/>
         </w:rPr>
       </w:pPr>
-      <w:bookmarkStart w:colFirst="0" w:colLast="0" w:name="_ir8ebsaj8xn5" w:id="6"/>
+      <w:bookmarkStart w:colFirst="0" w:colLast="0" w:name="_psb8wk2expn5" w:id="6"/>
       <w:bookmarkEnd w:id="6"/>
       <w:r>
         <w:rPr>
@@ -4231,7 +4818,7 @@
           <w:szCs w:val="24"/>
         </w:rPr>
       </w:pPr>
-      <w:bookmarkStart w:colFirst="0" w:colLast="0" w:name="_ruk55kf3tufb" w:id="7"/>
+      <w:bookmarkStart w:colFirst="0" w:colLast="0" w:name="_9zvtezfw4ne9" w:id="7"/>
       <w:bookmarkEnd w:id="7"/>
       <w:r>
         <w:rPr>
@@ -4266,7 +4853,7 @@
           <w:szCs w:val="24"/>
         </w:rPr>
       </w:pPr>
-      <w:bookmarkStart w:colFirst="0" w:colLast="0" w:name="_8t9gkotio21s" w:id="8"/>
+      <w:bookmarkStart w:colFirst="0" w:colLast="0" w:name="_31tkphsljtw7" w:id="8"/>
       <w:bookmarkEnd w:id="8"/>
       <w:r>
         <w:rPr>
@@ -4301,7 +4888,7 @@
           <w:szCs w:val="24"/>
         </w:rPr>
       </w:pPr>
-      <w:bookmarkStart w:colFirst="0" w:colLast="0" w:name="_93hnk4pbdz87" w:id="9"/>
+      <w:bookmarkStart w:colFirst="0" w:colLast="0" w:name="_h34pur5ui1q5" w:id="9"/>
       <w:bookmarkEnd w:id="9"/>
       <w:r>
         <w:rPr>
@@ -4322,7 +4909,7 @@
         <w:rPr>
           <w:rtl w:val="0"/>
         </w:rPr>
-        <w:t xml:space="preserve">A Cobrança é a obrigação financeira, e o Pagamento é a transação confirmada que a quita. As tentativas de pagamento ficam registradas à parte, o que permite guardar operações pendentes, recusadas ou expiradas sem tratá-las como pagamentos concluídos.</w:t>
+        <w:t xml:space="preserve">A Cobrança é a obrigação financeira, e o Pagamento é a transação confirmada que a quita. As tentativas de pagamento ficam registradas à parte, o que permite guardar operações pendentes, recusadas ou expiradas sem tratá-las como pagamentos concluídos. A Cobrança se especializa em Cobrança Avulsa, ligada a uma consulta, e em Mensalidade, ligada a uma recorrência.</w:t>
       </w:r>
     </w:p>
     <w:p>
@@ -4336,7 +4923,7 @@
           <w:szCs w:val="24"/>
         </w:rPr>
       </w:pPr>
-      <w:bookmarkStart w:colFirst="0" w:colLast="0" w:name="_hka3dbvci5e5" w:id="10"/>
+      <w:bookmarkStart w:colFirst="0" w:colLast="0" w:name="_f9gasntisr4v" w:id="10"/>
       <w:bookmarkEnd w:id="10"/>
       <w:r>
         <w:rPr>
@@ -4371,7 +4958,7 @@
           <w:szCs w:val="24"/>
         </w:rPr>
       </w:pPr>
-      <w:bookmarkStart w:colFirst="0" w:colLast="0" w:name="_j3inw4360biz" w:id="11"/>
+      <w:bookmarkStart w:colFirst="0" w:colLast="0" w:name="_qeeh54cbr7lt" w:id="11"/>
       <w:bookmarkEnd w:id="11"/>
       <w:r>
         <w:rPr>
@@ -4406,7 +4993,7 @@
           <w:szCs w:val="24"/>
         </w:rPr>
       </w:pPr>
-      <w:bookmarkStart w:colFirst="0" w:colLast="0" w:name="_ieie58ey50t0" w:id="12"/>
+      <w:bookmarkStart w:colFirst="0" w:colLast="0" w:name="_y6qy3ov24dyz" w:id="12"/>
       <w:bookmarkEnd w:id="12"/>
       <w:r>
         <w:rPr>
@@ -4430,7 +5017,7 @@
           <w:szCs w:val="24"/>
         </w:rPr>
       </w:pPr>
-      <w:bookmarkStart w:colFirst="0" w:colLast="0" w:name="_inxkw0ya3syw" w:id="13"/>
+      <w:bookmarkStart w:colFirst="0" w:colLast="0" w:name="_5n7uyeirt67q" w:id="13"/>
       <w:bookmarkEnd w:id="13"/>
       <w:r>
         <w:rPr>
@@ -4482,7 +5069,7 @@
           <w:szCs w:val="24"/>
         </w:rPr>
       </w:pPr>
-      <w:bookmarkStart w:colFirst="0" w:colLast="0" w:name="_y2luqirzi21p" w:id="14"/>
+      <w:bookmarkStart w:colFirst="0" w:colLast="0" w:name="_yiedksiraxss" w:id="14"/>
       <w:bookmarkEnd w:id="14"/>
       <w:r>
         <w:rPr>
@@ -4515,14 +5102,15 @@
           <w:numId w:val="2"/>
         </w:numPr>
         <w:pBdr>
-          <w:top w:color="auto" w:space="0" w:sz="0" w:val="none"/>
-          <w:bottom w:color="auto" w:space="0" w:sz="0" w:val="none"/>
-          <w:right w:color="auto" w:space="0" w:sz="0" w:val="none"/>
-          <w:between w:color="auto" w:space="0" w:sz="0" w:val="none"/>
+          <w:top w:color="000000" w:space="0" w:sz="0" w:val="none"/>
+          <w:bottom w:color="000000" w:space="0" w:sz="0" w:val="none"/>
+          <w:right w:color="000000" w:space="0" w:sz="0" w:val="none"/>
+          <w:between w:color="000000" w:space="0" w:sz="0" w:val="none"/>
         </w:pBdr>
         <w:spacing w:after="0" w:lineRule="auto"/>
         <w:ind w:left="720" w:hanging="360"/>
         <w:jc w:val="left"/>
+        <w:rPr/>
       </w:pPr>
       <w:r>
         <w:rPr>
@@ -4546,14 +5134,15 @@
           <w:numId w:val="2"/>
         </w:numPr>
         <w:pBdr>
-          <w:top w:color="auto" w:space="0" w:sz="0" w:val="none"/>
-          <w:bottom w:color="auto" w:space="0" w:sz="0" w:val="none"/>
-          <w:right w:color="auto" w:space="0" w:sz="0" w:val="none"/>
-          <w:between w:color="auto" w:space="0" w:sz="0" w:val="none"/>
+          <w:top w:color="000000" w:space="0" w:sz="0" w:val="none"/>
+          <w:bottom w:color="000000" w:space="0" w:sz="0" w:val="none"/>
+          <w:right w:color="000000" w:space="0" w:sz="0" w:val="none"/>
+          <w:between w:color="000000" w:space="0" w:sz="0" w:val="none"/>
         </w:pBdr>
         <w:spacing w:after="0" w:lineRule="auto"/>
         <w:ind w:left="720" w:hanging="360"/>
         <w:jc w:val="left"/>
+        <w:rPr/>
       </w:pPr>
       <w:r>
         <w:rPr>
@@ -4577,14 +5166,15 @@
           <w:numId w:val="2"/>
         </w:numPr>
         <w:pBdr>
-          <w:top w:color="auto" w:space="0" w:sz="0" w:val="none"/>
-          <w:bottom w:color="auto" w:space="0" w:sz="0" w:val="none"/>
-          <w:right w:color="auto" w:space="0" w:sz="0" w:val="none"/>
-          <w:between w:color="auto" w:space="0" w:sz="0" w:val="none"/>
+          <w:top w:color="000000" w:space="0" w:sz="0" w:val="none"/>
+          <w:bottom w:color="000000" w:space="0" w:sz="0" w:val="none"/>
+          <w:right w:color="000000" w:space="0" w:sz="0" w:val="none"/>
+          <w:between w:color="000000" w:space="0" w:sz="0" w:val="none"/>
         </w:pBdr>
         <w:spacing w:after="0" w:lineRule="auto"/>
         <w:ind w:left="720" w:hanging="360"/>
         <w:jc w:val="left"/>
+        <w:rPr/>
       </w:pPr>
       <w:r>
         <w:rPr>
@@ -4608,14 +5198,15 @@
           <w:numId w:val="2"/>
         </w:numPr>
         <w:pBdr>
-          <w:top w:color="auto" w:space="0" w:sz="0" w:val="none"/>
-          <w:bottom w:color="auto" w:space="0" w:sz="0" w:val="none"/>
-          <w:right w:color="auto" w:space="0" w:sz="0" w:val="none"/>
-          <w:between w:color="auto" w:space="0" w:sz="0" w:val="none"/>
+          <w:top w:color="000000" w:space="0" w:sz="0" w:val="none"/>
+          <w:bottom w:color="000000" w:space="0" w:sz="0" w:val="none"/>
+          <w:right w:color="000000" w:space="0" w:sz="0" w:val="none"/>
+          <w:between w:color="000000" w:space="0" w:sz="0" w:val="none"/>
         </w:pBdr>
         <w:spacing w:after="0" w:lineRule="auto"/>
         <w:ind w:left="720" w:hanging="360"/>
         <w:jc w:val="left"/>
+        <w:rPr/>
       </w:pPr>
       <w:r>
         <w:rPr>
@@ -4639,14 +5230,15 @@
           <w:numId w:val="2"/>
         </w:numPr>
         <w:pBdr>
-          <w:top w:color="auto" w:space="0" w:sz="0" w:val="none"/>
-          <w:bottom w:color="auto" w:space="0" w:sz="0" w:val="none"/>
-          <w:right w:color="auto" w:space="0" w:sz="0" w:val="none"/>
-          <w:between w:color="auto" w:space="0" w:sz="0" w:val="none"/>
+          <w:top w:color="000000" w:space="0" w:sz="0" w:val="none"/>
+          <w:bottom w:color="000000" w:space="0" w:sz="0" w:val="none"/>
+          <w:right w:color="000000" w:space="0" w:sz="0" w:val="none"/>
+          <w:between w:color="000000" w:space="0" w:sz="0" w:val="none"/>
         </w:pBdr>
         <w:spacing w:after="0" w:lineRule="auto"/>
         <w:ind w:left="720" w:hanging="360"/>
         <w:jc w:val="left"/>
+        <w:rPr/>
       </w:pPr>
       <w:r>
         <w:rPr>
@@ -4670,14 +5262,15 @@
           <w:numId w:val="2"/>
         </w:numPr>
         <w:pBdr>
-          <w:top w:color="auto" w:space="0" w:sz="0" w:val="none"/>
-          <w:bottom w:color="auto" w:space="0" w:sz="0" w:val="none"/>
-          <w:right w:color="auto" w:space="0" w:sz="0" w:val="none"/>
-          <w:between w:color="auto" w:space="0" w:sz="0" w:val="none"/>
+          <w:top w:color="000000" w:space="0" w:sz="0" w:val="none"/>
+          <w:bottom w:color="000000" w:space="0" w:sz="0" w:val="none"/>
+          <w:right w:color="000000" w:space="0" w:sz="0" w:val="none"/>
+          <w:between w:color="000000" w:space="0" w:sz="0" w:val="none"/>
         </w:pBdr>
         <w:spacing w:after="0" w:lineRule="auto"/>
         <w:ind w:left="720" w:hanging="360"/>
         <w:jc w:val="left"/>
+        <w:rPr/>
       </w:pPr>
       <w:r>
         <w:rPr>
@@ -4707,7 +5300,7 @@
           <w:szCs w:val="24"/>
         </w:rPr>
       </w:pPr>
-      <w:bookmarkStart w:colFirst="0" w:colLast="0" w:name="_vn4eeybe1n6i" w:id="15"/>
+      <w:bookmarkStart w:colFirst="0" w:colLast="0" w:name="_62vdkzls3bsl" w:id="15"/>
       <w:bookmarkEnd w:id="15"/>
       <w:r>
         <w:rPr>
@@ -4744,7 +5337,7 @@
           <w:szCs w:val="24"/>
         </w:rPr>
       </w:pPr>
-      <w:bookmarkStart w:colFirst="0" w:colLast="0" w:name="_xvt2byeg74zb" w:id="16"/>
+      <w:bookmarkStart w:colFirst="0" w:colLast="0" w:name="_iichei3jco44" w:id="16"/>
       <w:bookmarkEnd w:id="16"/>
       <w:r>
         <w:rPr>
@@ -5119,42 +5712,42 @@
                 <w:szCs w:val="20"/>
                 <w:rtl w:val="0"/>
               </w:rPr>
-              <w:t xml:space="preserve">Identificação, dados de acesso, situação da conta e perfil.</w:t>
-            </w:r>
-          </w:p>
-        </w:tc>
-        <w:tc>
-          <w:tcPr>
-            <w:tcBorders>
-              <w:top w:color="000000" w:space="0" w:sz="6" w:val="single"/>
-              <w:left w:color="000000" w:space="0" w:sz="6" w:val="single"/>
-              <w:bottom w:color="000000" w:space="0" w:sz="6" w:val="single"/>
-              <w:right w:color="000000" w:space="0" w:sz="6" w:val="single"/>
-            </w:tcBorders>
-            <w:tcMar>
-              <w:top w:w="60.0" w:type="dxa"/>
-              <w:left w:w="80.0" w:type="dxa"/>
-              <w:bottom w:w="60.0" w:type="dxa"/>
-              <w:right w:w="80.0" w:type="dxa"/>
-            </w:tcMar>
-            <w:vAlign w:val="top"/>
-          </w:tcPr>
-          <w:p>
-            <w:pPr>
-              <w:spacing w:after="0" w:line="240" w:lineRule="auto"/>
-              <w:jc w:val="left"/>
-              <w:rPr>
-                <w:sz w:val="20"/>
-                <w:szCs w:val="20"/>
-              </w:rPr>
-            </w:pPr>
-            <w:r>
-              <w:rPr>
-                <w:sz w:val="20"/>
-                <w:szCs w:val="20"/>
-                <w:rtl w:val="0"/>
-              </w:rPr>
-              <w:t xml:space="preserve">Controla os dados da conta e indica sua situação de acesso.</w:t>
+              <w:t xml:space="preserve">Identificação, e-mail, hash da senha, situação da conta e perfil.</w:t>
+            </w:r>
+          </w:p>
+        </w:tc>
+        <w:tc>
+          <w:tcPr>
+            <w:tcBorders>
+              <w:top w:color="000000" w:space="0" w:sz="6" w:val="single"/>
+              <w:left w:color="000000" w:space="0" w:sz="6" w:val="single"/>
+              <w:bottom w:color="000000" w:space="0" w:sz="6" w:val="single"/>
+              <w:right w:color="000000" w:space="0" w:sz="6" w:val="single"/>
+            </w:tcBorders>
+            <w:tcMar>
+              <w:top w:w="60.0" w:type="dxa"/>
+              <w:left w:w="80.0" w:type="dxa"/>
+              <w:bottom w:w="60.0" w:type="dxa"/>
+              <w:right w:w="80.0" w:type="dxa"/>
+            </w:tcMar>
+            <w:vAlign w:val="top"/>
+          </w:tcPr>
+          <w:p>
+            <w:pPr>
+              <w:spacing w:after="0" w:line="240" w:lineRule="auto"/>
+              <w:jc w:val="left"/>
+              <w:rPr>
+                <w:sz w:val="20"/>
+                <w:szCs w:val="20"/>
+              </w:rPr>
+            </w:pPr>
+            <w:r>
+              <w:rPr>
+                <w:sz w:val="20"/>
+                <w:szCs w:val="20"/>
+                <w:rtl w:val="0"/>
+              </w:rPr>
+              <w:t xml:space="preserve">Controla ativação, bloqueio e troca de senha e indica sua situação de acesso.</w:t>
             </w:r>
           </w:p>
         </w:tc>
@@ -5336,7 +5929,7 @@
                 <w:szCs w:val="20"/>
                 <w:rtl w:val="0"/>
               </w:rPr>
-              <w:t xml:space="preserve">Organiza as permissões do perfil.</w:t>
+              <w:t xml:space="preserve">Agrupa as permissões do perfil e ativa ou desativa as configuráveis.</w:t>
             </w:r>
           </w:p>
         </w:tc>
@@ -5609,7 +6202,7 @@
           <w:szCs w:val="24"/>
         </w:rPr>
       </w:pPr>
-      <w:bookmarkStart w:colFirst="0" w:colLast="0" w:name="_4puzxz3igwoi" w:id="17"/>
+      <w:bookmarkStart w:colFirst="0" w:colLast="0" w:name="_scm586y0l636" w:id="17"/>
       <w:bookmarkEnd w:id="17"/>
       <w:r>
         <w:rPr>
@@ -5984,42 +6577,42 @@
                 <w:szCs w:val="20"/>
                 <w:rtl w:val="0"/>
               </w:rPr>
-              <w:t xml:space="preserve">Identificação, dados cadastrais e informações administrativas do acompanhamento.</w:t>
-            </w:r>
-          </w:p>
-        </w:tc>
-        <w:tc>
-          <w:tcPr>
-            <w:tcBorders>
-              <w:top w:color="000000" w:space="0" w:sz="6" w:val="single"/>
-              <w:left w:color="000000" w:space="0" w:sz="6" w:val="single"/>
-              <w:bottom w:color="000000" w:space="0" w:sz="6" w:val="single"/>
-              <w:right w:color="000000" w:space="0" w:sz="6" w:val="single"/>
-            </w:tcBorders>
-            <w:tcMar>
-              <w:top w:w="60.0" w:type="dxa"/>
-              <w:left w:w="80.0" w:type="dxa"/>
-              <w:bottom w:w="60.0" w:type="dxa"/>
-              <w:right w:w="80.0" w:type="dxa"/>
-            </w:tcMar>
-            <w:vAlign w:val="top"/>
-          </w:tcPr>
-          <w:p>
-            <w:pPr>
-              <w:spacing w:after="0" w:line="240" w:lineRule="auto"/>
-              <w:jc w:val="left"/>
-              <w:rPr>
-                <w:sz w:val="20"/>
-                <w:szCs w:val="20"/>
-              </w:rPr>
-            </w:pPr>
-            <w:r>
-              <w:rPr>
-                <w:sz w:val="20"/>
-                <w:szCs w:val="20"/>
-                <w:rtl w:val="0"/>
-              </w:rPr>
-              <w:t xml:space="preserve">Mantém seus dados cadastrais e identifica seus vínculos administrativos com os atendimentos.</w:t>
+              <w:t xml:space="preserve">Identificação, data de nascimento, documento, contatos e informações administrativas do acompanhamento.</w:t>
+            </w:r>
+          </w:p>
+        </w:tc>
+        <w:tc>
+          <w:tcPr>
+            <w:tcBorders>
+              <w:top w:color="000000" w:space="0" w:sz="6" w:val="single"/>
+              <w:left w:color="000000" w:space="0" w:sz="6" w:val="single"/>
+              <w:bottom w:color="000000" w:space="0" w:sz="6" w:val="single"/>
+              <w:right w:color="000000" w:space="0" w:sz="6" w:val="single"/>
+            </w:tcBorders>
+            <w:tcMar>
+              <w:top w:w="60.0" w:type="dxa"/>
+              <w:left w:w="80.0" w:type="dxa"/>
+              <w:bottom w:w="60.0" w:type="dxa"/>
+              <w:right w:w="80.0" w:type="dxa"/>
+            </w:tcMar>
+            <w:vAlign w:val="top"/>
+          </w:tcPr>
+          <w:p>
+            <w:pPr>
+              <w:spacing w:after="0" w:line="240" w:lineRule="auto"/>
+              <w:jc w:val="left"/>
+              <w:rPr>
+                <w:sz w:val="20"/>
+                <w:szCs w:val="20"/>
+              </w:rPr>
+            </w:pPr>
+            <w:r>
+              <w:rPr>
+                <w:sz w:val="20"/>
+                <w:szCs w:val="20"/>
+                <w:rtl w:val="0"/>
+              </w:rPr>
+              <w:t xml:space="preserve">Mantém seus dados cadastrais e indica se é menor de idade e se já tem conta própria.</w:t>
             </w:r>
           </w:p>
         </w:tc>
@@ -6166,7 +6759,7 @@
                 <w:szCs w:val="20"/>
                 <w:rtl w:val="0"/>
               </w:rPr>
-              <w:t xml:space="preserve">Identificação profissional, especialidades, dados de apresentação e situação cadastral.</w:t>
+              <w:t xml:space="preserve">Registro profissional, áreas de atuação, apresentação, aceite de novos pacientes e situação cadastral.</w:t>
             </w:r>
           </w:p>
         </w:tc>
@@ -6236,7 +6829,7 @@
                 <w:szCs w:val="20"/>
                 <w:rtl w:val="0"/>
               </w:rPr>
-              <w:t xml:space="preserve">Usuário, Disponibilidade, Agendamento, Atendimento.</w:t>
+              <w:t xml:space="preserve">Usuário, Área de Atuação, Disponibilidade, Agendamento, Atendimento.</w:t>
             </w:r>
           </w:p>
         </w:tc>
@@ -6423,6 +7016,188 @@
           </w:p>
         </w:tc>
       </w:tr>
+      <w:tr>
+        <w:trPr>
+          <w:cantSplit w:val="0"/>
+          <w:trHeight w:val="1530" w:hRule="atLeast"/>
+          <w:tblHeader w:val="0"/>
+        </w:trPr>
+        <w:tc>
+          <w:tcPr>
+            <w:tcBorders>
+              <w:top w:color="000000" w:space="0" w:sz="6" w:val="single"/>
+              <w:left w:color="000000" w:space="0" w:sz="6" w:val="single"/>
+              <w:bottom w:color="000000" w:space="0" w:sz="6" w:val="single"/>
+              <w:right w:color="000000" w:space="0" w:sz="6" w:val="single"/>
+            </w:tcBorders>
+            <w:tcMar>
+              <w:top w:w="60.0" w:type="dxa"/>
+              <w:left w:w="80.0" w:type="dxa"/>
+              <w:bottom w:w="60.0" w:type="dxa"/>
+              <w:right w:w="80.0" w:type="dxa"/>
+            </w:tcMar>
+            <w:vAlign w:val="top"/>
+          </w:tcPr>
+          <w:p>
+            <w:pPr>
+              <w:spacing w:after="0" w:line="240" w:lineRule="auto"/>
+              <w:jc w:val="left"/>
+              <w:rPr>
+                <w:sz w:val="20"/>
+                <w:szCs w:val="20"/>
+              </w:rPr>
+            </w:pPr>
+            <w:r>
+              <w:rPr>
+                <w:sz w:val="20"/>
+                <w:szCs w:val="20"/>
+                <w:rtl w:val="0"/>
+              </w:rPr>
+              <w:t xml:space="preserve">Área de Atuação</w:t>
+            </w:r>
+          </w:p>
+        </w:tc>
+        <w:tc>
+          <w:tcPr>
+            <w:tcBorders>
+              <w:top w:color="000000" w:space="0" w:sz="6" w:val="single"/>
+              <w:left w:color="000000" w:space="0" w:sz="6" w:val="single"/>
+              <w:bottom w:color="000000" w:space="0" w:sz="6" w:val="single"/>
+              <w:right w:color="000000" w:space="0" w:sz="6" w:val="single"/>
+            </w:tcBorders>
+            <w:tcMar>
+              <w:top w:w="60.0" w:type="dxa"/>
+              <w:left w:w="80.0" w:type="dxa"/>
+              <w:bottom w:w="60.0" w:type="dxa"/>
+              <w:right w:w="80.0" w:type="dxa"/>
+            </w:tcMar>
+            <w:vAlign w:val="top"/>
+          </w:tcPr>
+          <w:p>
+            <w:pPr>
+              <w:spacing w:after="0" w:line="240" w:lineRule="auto"/>
+              <w:jc w:val="left"/>
+              <w:rPr>
+                <w:sz w:val="20"/>
+                <w:szCs w:val="20"/>
+              </w:rPr>
+            </w:pPr>
+            <w:r>
+              <w:rPr>
+                <w:sz w:val="20"/>
+                <w:szCs w:val="20"/>
+                <w:rtl w:val="0"/>
+              </w:rPr>
+              <w:t xml:space="preserve">Representar uma área da Psicologia escolhida de um catálogo fixo.</w:t>
+            </w:r>
+          </w:p>
+        </w:tc>
+        <w:tc>
+          <w:tcPr>
+            <w:tcBorders>
+              <w:top w:color="000000" w:space="0" w:sz="6" w:val="single"/>
+              <w:left w:color="000000" w:space="0" w:sz="6" w:val="single"/>
+              <w:bottom w:color="000000" w:space="0" w:sz="6" w:val="single"/>
+              <w:right w:color="000000" w:space="0" w:sz="6" w:val="single"/>
+            </w:tcBorders>
+            <w:tcMar>
+              <w:top w:w="60.0" w:type="dxa"/>
+              <w:left w:w="80.0" w:type="dxa"/>
+              <w:bottom w:w="60.0" w:type="dxa"/>
+              <w:right w:w="80.0" w:type="dxa"/>
+            </w:tcMar>
+            <w:vAlign w:val="top"/>
+          </w:tcPr>
+          <w:p>
+            <w:pPr>
+              <w:spacing w:after="0" w:line="240" w:lineRule="auto"/>
+              <w:jc w:val="left"/>
+              <w:rPr>
+                <w:sz w:val="20"/>
+                <w:szCs w:val="20"/>
+              </w:rPr>
+            </w:pPr>
+            <w:r>
+              <w:rPr>
+                <w:sz w:val="20"/>
+                <w:szCs w:val="20"/>
+                <w:rtl w:val="0"/>
+              </w:rPr>
+              <w:t xml:space="preserve">Nome e descrição da área.</w:t>
+            </w:r>
+          </w:p>
+        </w:tc>
+        <w:tc>
+          <w:tcPr>
+            <w:tcBorders>
+              <w:top w:color="000000" w:space="0" w:sz="6" w:val="single"/>
+              <w:left w:color="000000" w:space="0" w:sz="6" w:val="single"/>
+              <w:bottom w:color="000000" w:space="0" w:sz="6" w:val="single"/>
+              <w:right w:color="000000" w:space="0" w:sz="6" w:val="single"/>
+            </w:tcBorders>
+            <w:tcMar>
+              <w:top w:w="60.0" w:type="dxa"/>
+              <w:left w:w="80.0" w:type="dxa"/>
+              <w:bottom w:w="60.0" w:type="dxa"/>
+              <w:right w:w="80.0" w:type="dxa"/>
+            </w:tcMar>
+            <w:vAlign w:val="top"/>
+          </w:tcPr>
+          <w:p>
+            <w:pPr>
+              <w:spacing w:after="0" w:line="240" w:lineRule="auto"/>
+              <w:jc w:val="left"/>
+              <w:rPr>
+                <w:sz w:val="20"/>
+                <w:szCs w:val="20"/>
+              </w:rPr>
+            </w:pPr>
+            <w:r>
+              <w:rPr>
+                <w:sz w:val="20"/>
+                <w:szCs w:val="20"/>
+                <w:rtl w:val="0"/>
+              </w:rPr>
+              <w:t xml:space="preserve">Identifica a área e permite filtrar profissionais por ela.</w:t>
+            </w:r>
+          </w:p>
+        </w:tc>
+        <w:tc>
+          <w:tcPr>
+            <w:tcBorders>
+              <w:top w:color="000000" w:space="0" w:sz="6" w:val="single"/>
+              <w:left w:color="000000" w:space="0" w:sz="6" w:val="single"/>
+              <w:bottom w:color="000000" w:space="0" w:sz="6" w:val="single"/>
+              <w:right w:color="000000" w:space="0" w:sz="6" w:val="single"/>
+            </w:tcBorders>
+            <w:tcMar>
+              <w:top w:w="60.0" w:type="dxa"/>
+              <w:left w:w="80.0" w:type="dxa"/>
+              <w:bottom w:w="60.0" w:type="dxa"/>
+              <w:right w:w="80.0" w:type="dxa"/>
+            </w:tcMar>
+            <w:vAlign w:val="top"/>
+          </w:tcPr>
+          <w:p>
+            <w:pPr>
+              <w:spacing w:after="0" w:line="240" w:lineRule="auto"/>
+              <w:jc w:val="left"/>
+              <w:rPr>
+                <w:sz w:val="20"/>
+                <w:szCs w:val="20"/>
+              </w:rPr>
+            </w:pPr>
+            <w:r>
+              <w:rPr>
+                <w:sz w:val="20"/>
+                <w:szCs w:val="20"/>
+                <w:rtl w:val="0"/>
+              </w:rPr>
+              <w:t xml:space="preserve">Psicólogo.</w:t>
+            </w:r>
+          </w:p>
+        </w:tc>
+      </w:tr>
     </w:tbl>
     <w:p>
       <w:pPr>
@@ -6460,7 +7235,7 @@
         <w:rPr>
           <w:rtl w:val="0"/>
         </w:rPr>
-        <w:t xml:space="preserve"> Responsável não vira uma quinta classe de perfil. A condição vem do vínculo com um paciente, o que permite que um mesmo usuário tenha responsabilidades e permissões diferentes para cada dependente.</w:t>
+        <w:t xml:space="preserve"> Responsável não vira uma quinta classe de perfil. A condição vem do vínculo com um paciente, o que permite que um mesmo usuário tenha responsabilidades e permissões diferentes para cada dependente. A Área de Atuação é uma classe de catálogo, e não um texto livre no Psicólogo, para manter as áreas padronizadas (RN-023) e permitir que um profissional atue em várias delas.</w:t>
       </w:r>
     </w:p>
     <w:p>
@@ -6474,7 +7249,7 @@
           <w:szCs w:val="24"/>
         </w:rPr>
       </w:pPr>
-      <w:bookmarkStart w:colFirst="0" w:colLast="0" w:name="_yyg2i41d9ltc" w:id="18"/>
+      <w:bookmarkStart w:colFirst="0" w:colLast="0" w:name="_m8tkc4914ee1" w:id="18"/>
       <w:bookmarkEnd w:id="18"/>
       <w:r>
         <w:rPr>
@@ -7248,7 +8023,7 @@
                 <w:szCs w:val="20"/>
                 <w:rtl w:val="0"/>
               </w:rPr>
-              <w:t xml:space="preserve">Controla as mudanças de situação da consulta, seguindo as regras de agendamento, reagendamento e cancelamento.</w:t>
+              <w:t xml:space="preserve">Controla confirmação, reagendamento, cancelamento, realização e não comparecimento, preservando a consulta original quando há reagendamento.</w:t>
             </w:r>
           </w:p>
         </w:tc>
@@ -7339,7 +8114,7 @@
           <w:szCs w:val="24"/>
         </w:rPr>
       </w:pPr>
-      <w:bookmarkStart w:colFirst="0" w:colLast="0" w:name="_ur57zevhfuhw" w:id="19"/>
+      <w:bookmarkStart w:colFirst="0" w:colLast="0" w:name="_3sadqc1n3mh7" w:id="19"/>
       <w:bookmarkEnd w:id="19"/>
       <w:r>
         <w:rPr>
@@ -7714,7 +8489,7 @@
                 <w:szCs w:val="20"/>
                 <w:rtl w:val="0"/>
               </w:rPr>
-              <w:t xml:space="preserve">Agendamento de origem, paciente, Psicólogo, data e situação do atendimento.</w:t>
+              <w:t xml:space="preserve">Agendamento de origem (quando houver), paciente, Psicólogo, data e situação do atendimento.</w:t>
             </w:r>
           </w:p>
         </w:tc>
@@ -7896,77 +8671,259 @@
                 <w:szCs w:val="20"/>
                 <w:rtl w:val="0"/>
               </w:rPr>
-              <w:t xml:space="preserve">Atendimento relacionado, Psicólogo responsável, conteúdo, data e histórico de versões.</w:t>
-            </w:r>
-          </w:p>
-        </w:tc>
-        <w:tc>
-          <w:tcPr>
-            <w:tcBorders>
-              <w:top w:color="000000" w:space="0" w:sz="6" w:val="single"/>
-              <w:left w:color="000000" w:space="0" w:sz="6" w:val="single"/>
-              <w:bottom w:color="000000" w:space="0" w:sz="6" w:val="single"/>
-              <w:right w:color="000000" w:space="0" w:sz="6" w:val="single"/>
-            </w:tcBorders>
-            <w:tcMar>
-              <w:top w:w="60.0" w:type="dxa"/>
-              <w:left w:w="80.0" w:type="dxa"/>
-              <w:bottom w:w="60.0" w:type="dxa"/>
-              <w:right w:w="80.0" w:type="dxa"/>
-            </w:tcMar>
-            <w:vAlign w:val="top"/>
-          </w:tcPr>
-          <w:p>
-            <w:pPr>
-              <w:spacing w:after="0" w:line="240" w:lineRule="auto"/>
-              <w:jc w:val="left"/>
-              <w:rPr>
-                <w:sz w:val="20"/>
-                <w:szCs w:val="20"/>
-              </w:rPr>
-            </w:pPr>
-            <w:r>
-              <w:rPr>
-                <w:sz w:val="20"/>
-                <w:szCs w:val="20"/>
-                <w:rtl w:val="0"/>
-              </w:rPr>
-              <w:t xml:space="preserve">Mantém os registros clínicos e a rastreabilidade das alterações autorizadas.</w:t>
-            </w:r>
-          </w:p>
-        </w:tc>
-        <w:tc>
-          <w:tcPr>
-            <w:tcBorders>
-              <w:top w:color="000000" w:space="0" w:sz="6" w:val="single"/>
-              <w:left w:color="000000" w:space="0" w:sz="6" w:val="single"/>
-              <w:bottom w:color="000000" w:space="0" w:sz="6" w:val="single"/>
-              <w:right w:color="000000" w:space="0" w:sz="6" w:val="single"/>
-            </w:tcBorders>
-            <w:tcMar>
-              <w:top w:w="60.0" w:type="dxa"/>
-              <w:left w:w="80.0" w:type="dxa"/>
-              <w:bottom w:w="60.0" w:type="dxa"/>
-              <w:right w:w="80.0" w:type="dxa"/>
-            </w:tcMar>
-            <w:vAlign w:val="top"/>
-          </w:tcPr>
-          <w:p>
-            <w:pPr>
-              <w:spacing w:after="0" w:line="240" w:lineRule="auto"/>
-              <w:jc w:val="left"/>
-              <w:rPr>
-                <w:sz w:val="20"/>
-                <w:szCs w:val="20"/>
-              </w:rPr>
-            </w:pPr>
-            <w:r>
-              <w:rPr>
-                <w:sz w:val="20"/>
-                <w:szCs w:val="20"/>
-                <w:rtl w:val="0"/>
-              </w:rPr>
-              <w:t xml:space="preserve">Atendimento, Psicólogo.</w:t>
+              <w:t xml:space="preserve">Paciente, Psicólogo autor, Atendimento relacionado (quando houver), data e suas versões.</w:t>
+            </w:r>
+          </w:p>
+        </w:tc>
+        <w:tc>
+          <w:tcPr>
+            <w:tcBorders>
+              <w:top w:color="000000" w:space="0" w:sz="6" w:val="single"/>
+              <w:left w:color="000000" w:space="0" w:sz="6" w:val="single"/>
+              <w:bottom w:color="000000" w:space="0" w:sz="6" w:val="single"/>
+              <w:right w:color="000000" w:space="0" w:sz="6" w:val="single"/>
+            </w:tcBorders>
+            <w:tcMar>
+              <w:top w:w="60.0" w:type="dxa"/>
+              <w:left w:w="80.0" w:type="dxa"/>
+              <w:bottom w:w="60.0" w:type="dxa"/>
+              <w:right w:w="80.0" w:type="dxa"/>
+            </w:tcMar>
+            <w:vAlign w:val="top"/>
+          </w:tcPr>
+          <w:p>
+            <w:pPr>
+              <w:spacing w:after="0" w:line="240" w:lineRule="auto"/>
+              <w:jc w:val="left"/>
+              <w:rPr>
+                <w:sz w:val="20"/>
+                <w:szCs w:val="20"/>
+              </w:rPr>
+            </w:pPr>
+            <w:r>
+              <w:rPr>
+                <w:sz w:val="20"/>
+                <w:szCs w:val="20"/>
+                <w:rtl w:val="0"/>
+              </w:rPr>
+              <w:t xml:space="preserve">Registra e revisa o conteúdo clínico, criando uma nova versão a cada alteração sem apagar as anteriores.</w:t>
+            </w:r>
+          </w:p>
+        </w:tc>
+        <w:tc>
+          <w:tcPr>
+            <w:tcBorders>
+              <w:top w:color="000000" w:space="0" w:sz="6" w:val="single"/>
+              <w:left w:color="000000" w:space="0" w:sz="6" w:val="single"/>
+              <w:bottom w:color="000000" w:space="0" w:sz="6" w:val="single"/>
+              <w:right w:color="000000" w:space="0" w:sz="6" w:val="single"/>
+            </w:tcBorders>
+            <w:tcMar>
+              <w:top w:w="60.0" w:type="dxa"/>
+              <w:left w:w="80.0" w:type="dxa"/>
+              <w:bottom w:w="60.0" w:type="dxa"/>
+              <w:right w:w="80.0" w:type="dxa"/>
+            </w:tcMar>
+            <w:vAlign w:val="top"/>
+          </w:tcPr>
+          <w:p>
+            <w:pPr>
+              <w:spacing w:after="0" w:line="240" w:lineRule="auto"/>
+              <w:jc w:val="left"/>
+              <w:rPr>
+                <w:sz w:val="20"/>
+                <w:szCs w:val="20"/>
+              </w:rPr>
+            </w:pPr>
+            <w:r>
+              <w:rPr>
+                <w:sz w:val="20"/>
+                <w:szCs w:val="20"/>
+                <w:rtl w:val="0"/>
+              </w:rPr>
+              <w:t xml:space="preserve">Atendimento, Paciente, Psicólogo, Versão da Evolução.</w:t>
+            </w:r>
+          </w:p>
+        </w:tc>
+      </w:tr>
+      <w:tr>
+        <w:trPr>
+          <w:cantSplit w:val="0"/>
+          <w:trHeight w:val="1530" w:hRule="atLeast"/>
+          <w:tblHeader w:val="0"/>
+        </w:trPr>
+        <w:tc>
+          <w:tcPr>
+            <w:tcBorders>
+              <w:top w:color="000000" w:space="0" w:sz="6" w:val="single"/>
+              <w:left w:color="000000" w:space="0" w:sz="6" w:val="single"/>
+              <w:bottom w:color="000000" w:space="0" w:sz="6" w:val="single"/>
+              <w:right w:color="000000" w:space="0" w:sz="6" w:val="single"/>
+            </w:tcBorders>
+            <w:tcMar>
+              <w:top w:w="60.0" w:type="dxa"/>
+              <w:left w:w="80.0" w:type="dxa"/>
+              <w:bottom w:w="60.0" w:type="dxa"/>
+              <w:right w:w="80.0" w:type="dxa"/>
+            </w:tcMar>
+            <w:vAlign w:val="top"/>
+          </w:tcPr>
+          <w:p>
+            <w:pPr>
+              <w:spacing w:after="0" w:line="240" w:lineRule="auto"/>
+              <w:jc w:val="left"/>
+              <w:rPr>
+                <w:sz w:val="20"/>
+                <w:szCs w:val="20"/>
+              </w:rPr>
+            </w:pPr>
+            <w:r>
+              <w:rPr>
+                <w:sz w:val="20"/>
+                <w:szCs w:val="20"/>
+                <w:rtl w:val="0"/>
+              </w:rPr>
+              <w:t xml:space="preserve">Versão da Evolução</w:t>
+            </w:r>
+          </w:p>
+        </w:tc>
+        <w:tc>
+          <w:tcPr>
+            <w:tcBorders>
+              <w:top w:color="000000" w:space="0" w:sz="6" w:val="single"/>
+              <w:left w:color="000000" w:space="0" w:sz="6" w:val="single"/>
+              <w:bottom w:color="000000" w:space="0" w:sz="6" w:val="single"/>
+              <w:right w:color="000000" w:space="0" w:sz="6" w:val="single"/>
+            </w:tcBorders>
+            <w:tcMar>
+              <w:top w:w="60.0" w:type="dxa"/>
+              <w:left w:w="80.0" w:type="dxa"/>
+              <w:bottom w:w="60.0" w:type="dxa"/>
+              <w:right w:w="80.0" w:type="dxa"/>
+            </w:tcMar>
+            <w:vAlign w:val="top"/>
+          </w:tcPr>
+          <w:p>
+            <w:pPr>
+              <w:spacing w:after="0" w:line="240" w:lineRule="auto"/>
+              <w:jc w:val="left"/>
+              <w:rPr>
+                <w:sz w:val="20"/>
+                <w:szCs w:val="20"/>
+              </w:rPr>
+            </w:pPr>
+            <w:r>
+              <w:rPr>
+                <w:sz w:val="20"/>
+                <w:szCs w:val="20"/>
+                <w:rtl w:val="0"/>
+              </w:rPr>
+              <w:t xml:space="preserve">Representar o conteúdo de uma Evolução Clínica em um momento.</w:t>
+            </w:r>
+          </w:p>
+        </w:tc>
+        <w:tc>
+          <w:tcPr>
+            <w:tcBorders>
+              <w:top w:color="000000" w:space="0" w:sz="6" w:val="single"/>
+              <w:left w:color="000000" w:space="0" w:sz="6" w:val="single"/>
+              <w:bottom w:color="000000" w:space="0" w:sz="6" w:val="single"/>
+              <w:right w:color="000000" w:space="0" w:sz="6" w:val="single"/>
+            </w:tcBorders>
+            <w:tcMar>
+              <w:top w:w="60.0" w:type="dxa"/>
+              <w:left w:w="80.0" w:type="dxa"/>
+              <w:bottom w:w="60.0" w:type="dxa"/>
+              <w:right w:w="80.0" w:type="dxa"/>
+            </w:tcMar>
+            <w:vAlign w:val="top"/>
+          </w:tcPr>
+          <w:p>
+            <w:pPr>
+              <w:spacing w:after="0" w:line="240" w:lineRule="auto"/>
+              <w:jc w:val="left"/>
+              <w:rPr>
+                <w:sz w:val="20"/>
+                <w:szCs w:val="20"/>
+              </w:rPr>
+            </w:pPr>
+            <w:r>
+              <w:rPr>
+                <w:sz w:val="20"/>
+                <w:szCs w:val="20"/>
+                <w:rtl w:val="0"/>
+              </w:rPr>
+              <w:t xml:space="preserve">Número da versão, conteúdo e data.</w:t>
+            </w:r>
+          </w:p>
+        </w:tc>
+        <w:tc>
+          <w:tcPr>
+            <w:tcBorders>
+              <w:top w:color="000000" w:space="0" w:sz="6" w:val="single"/>
+              <w:left w:color="000000" w:space="0" w:sz="6" w:val="single"/>
+              <w:bottom w:color="000000" w:space="0" w:sz="6" w:val="single"/>
+              <w:right w:color="000000" w:space="0" w:sz="6" w:val="single"/>
+            </w:tcBorders>
+            <w:tcMar>
+              <w:top w:w="60.0" w:type="dxa"/>
+              <w:left w:w="80.0" w:type="dxa"/>
+              <w:bottom w:w="60.0" w:type="dxa"/>
+              <w:right w:w="80.0" w:type="dxa"/>
+            </w:tcMar>
+            <w:vAlign w:val="top"/>
+          </w:tcPr>
+          <w:p>
+            <w:pPr>
+              <w:spacing w:after="0" w:line="240" w:lineRule="auto"/>
+              <w:jc w:val="left"/>
+              <w:rPr>
+                <w:sz w:val="20"/>
+                <w:szCs w:val="20"/>
+              </w:rPr>
+            </w:pPr>
+            <w:r>
+              <w:rPr>
+                <w:sz w:val="20"/>
+                <w:szCs w:val="20"/>
+                <w:rtl w:val="0"/>
+              </w:rPr>
+              <w:t xml:space="preserve">Preserva cada conteúdo registrado, sem alteração posterior.</w:t>
+            </w:r>
+          </w:p>
+        </w:tc>
+        <w:tc>
+          <w:tcPr>
+            <w:tcBorders>
+              <w:top w:color="000000" w:space="0" w:sz="6" w:val="single"/>
+              <w:left w:color="000000" w:space="0" w:sz="6" w:val="single"/>
+              <w:bottom w:color="000000" w:space="0" w:sz="6" w:val="single"/>
+              <w:right w:color="000000" w:space="0" w:sz="6" w:val="single"/>
+            </w:tcBorders>
+            <w:tcMar>
+              <w:top w:w="60.0" w:type="dxa"/>
+              <w:left w:w="80.0" w:type="dxa"/>
+              <w:bottom w:w="60.0" w:type="dxa"/>
+              <w:right w:w="80.0" w:type="dxa"/>
+            </w:tcMar>
+            <w:vAlign w:val="top"/>
+          </w:tcPr>
+          <w:p>
+            <w:pPr>
+              <w:spacing w:after="0" w:line="240" w:lineRule="auto"/>
+              <w:jc w:val="left"/>
+              <w:rPr>
+                <w:sz w:val="20"/>
+                <w:szCs w:val="20"/>
+              </w:rPr>
+            </w:pPr>
+            <w:r>
+              <w:rPr>
+                <w:sz w:val="20"/>
+                <w:szCs w:val="20"/>
+                <w:rtl w:val="0"/>
+              </w:rPr>
+              <w:t xml:space="preserve">Evolução Clínica.</w:t>
             </w:r>
           </w:p>
         </w:tc>
@@ -8078,7 +9035,7 @@
                 <w:szCs w:val="20"/>
                 <w:rtl w:val="0"/>
               </w:rPr>
-              <w:t xml:space="preserve">Identificação, tipo, conteúdo ou referência a ele, paciente e profissional responsável.</w:t>
+              <w:t xml:space="preserve">Identificação, tipo, conteúdo ou referência a ele, paciente e profissional responsável, quando houver.</w:t>
             </w:r>
           </w:p>
         </w:tc>
@@ -8190,7 +9147,7 @@
         <w:rPr>
           <w:rtl w:val="0"/>
         </w:rPr>
-        <w:t xml:space="preserve"> o Atendimento registra que a consulta aconteceu, e a Evolução Clínica guarda as informações clínicas produzidas pelo profissional. O Documento fica separado para que compartilhar uma informação não dê acesso direto às anotações internas de evolução.</w:t>
+        <w:t xml:space="preserve"> o Atendimento registra que a consulta aconteceu, e a Evolução Clínica guarda as informações clínicas produzidas pelo profissional. O Documento fica separado para que compartilhar uma informação não dê acesso direto às anotações internas de evolução. Cada revisão da Evolução gera uma Versão da Evolução, o que garante o histórico exigido pelo RF-040 sem apagar o conteúdo anterior.</w:t>
       </w:r>
     </w:p>
     <w:p>
@@ -8204,7 +9161,7 @@
           <w:szCs w:val="24"/>
         </w:rPr>
       </w:pPr>
-      <w:bookmarkStart w:colFirst="0" w:colLast="0" w:name="_9d5bpuup8vls" w:id="20"/>
+      <w:bookmarkStart w:colFirst="0" w:colLast="0" w:name="_io4w4f34z36o" w:id="20"/>
       <w:bookmarkEnd w:id="20"/>
       <w:r>
         <w:rPr>
@@ -8579,7 +9536,7 @@
                 <w:szCs w:val="20"/>
                 <w:rtl w:val="0"/>
               </w:rPr>
-              <w:t xml:space="preserve">Paciente, Psicólogo, periodicidade, horário reservado, situação e condições do acordo.</w:t>
+              <w:t xml:space="preserve">Paciente, Psicólogo, periodicidade, dia, horário reservado, vigência e situação do acordo.</w:t>
             </w:r>
           </w:p>
         </w:tc>
@@ -8705,7 +9662,7 @@
           <w:szCs w:val="24"/>
         </w:rPr>
       </w:pPr>
-      <w:bookmarkStart w:colFirst="0" w:colLast="0" w:name="_lrpsg0201sus" w:id="21"/>
+      <w:bookmarkStart w:colFirst="0" w:colLast="0" w:name="_yuzglst0xl4s" w:id="21"/>
       <w:bookmarkEnd w:id="21"/>
       <w:r>
         <w:rPr>
@@ -9045,77 +10002,77 @@
                 <w:szCs w:val="20"/>
                 <w:rtl w:val="0"/>
               </w:rPr>
-              <w:t xml:space="preserve">Representar um valor devido por consulta avulsa ou mensalidade.</w:t>
-            </w:r>
-          </w:p>
-        </w:tc>
-        <w:tc>
-          <w:tcPr>
-            <w:tcBorders>
-              <w:top w:color="000000" w:space="0" w:sz="6" w:val="single"/>
-              <w:left w:color="000000" w:space="0" w:sz="6" w:val="single"/>
-              <w:bottom w:color="000000" w:space="0" w:sz="6" w:val="single"/>
-              <w:right w:color="000000" w:space="0" w:sz="6" w:val="single"/>
-            </w:tcBorders>
-            <w:tcMar>
-              <w:top w:w="60.0" w:type="dxa"/>
-              <w:left w:w="80.0" w:type="dxa"/>
-              <w:bottom w:w="60.0" w:type="dxa"/>
-              <w:right w:w="80.0" w:type="dxa"/>
-            </w:tcMar>
-            <w:vAlign w:val="top"/>
-          </w:tcPr>
-          <w:p>
-            <w:pPr>
-              <w:spacing w:after="0" w:line="240" w:lineRule="auto"/>
-              <w:jc w:val="left"/>
-              <w:rPr>
-                <w:sz w:val="20"/>
-                <w:szCs w:val="20"/>
-              </w:rPr>
-            </w:pPr>
-            <w:r>
-              <w:rPr>
-                <w:sz w:val="20"/>
-                <w:szCs w:val="20"/>
-                <w:rtl w:val="0"/>
-              </w:rPr>
-              <w:t xml:space="preserve">Paciente, valor, vencimento, modalidade, período de referência e situação financeira.</w:t>
-            </w:r>
-          </w:p>
-        </w:tc>
-        <w:tc>
-          <w:tcPr>
-            <w:tcBorders>
-              <w:top w:color="000000" w:space="0" w:sz="6" w:val="single"/>
-              <w:left w:color="000000" w:space="0" w:sz="6" w:val="single"/>
-              <w:bottom w:color="000000" w:space="0" w:sz="6" w:val="single"/>
-              <w:right w:color="000000" w:space="0" w:sz="6" w:val="single"/>
-            </w:tcBorders>
-            <w:tcMar>
-              <w:top w:w="60.0" w:type="dxa"/>
-              <w:left w:w="80.0" w:type="dxa"/>
-              <w:bottom w:w="60.0" w:type="dxa"/>
-              <w:right w:w="80.0" w:type="dxa"/>
-            </w:tcMar>
-            <w:vAlign w:val="top"/>
-          </w:tcPr>
-          <w:p>
-            <w:pPr>
-              <w:spacing w:after="0" w:line="240" w:lineRule="auto"/>
-              <w:jc w:val="left"/>
-              <w:rPr>
-                <w:sz w:val="20"/>
-                <w:szCs w:val="20"/>
-              </w:rPr>
-            </w:pPr>
-            <w:r>
-              <w:rPr>
-                <w:sz w:val="20"/>
-                <w:szCs w:val="20"/>
-                <w:rtl w:val="0"/>
-              </w:rPr>
-              <w:t xml:space="preserve">Controla a situação da obrigação e reconhece a quitação quando há confirmação válida.</w:t>
+              <w:t xml:space="preserve">Representar, de forma abstrata, um valor devido pelo paciente.</w:t>
+            </w:r>
+          </w:p>
+        </w:tc>
+        <w:tc>
+          <w:tcPr>
+            <w:tcBorders>
+              <w:top w:color="000000" w:space="0" w:sz="6" w:val="single"/>
+              <w:left w:color="000000" w:space="0" w:sz="6" w:val="single"/>
+              <w:bottom w:color="000000" w:space="0" w:sz="6" w:val="single"/>
+              <w:right w:color="000000" w:space="0" w:sz="6" w:val="single"/>
+            </w:tcBorders>
+            <w:tcMar>
+              <w:top w:w="60.0" w:type="dxa"/>
+              <w:left w:w="80.0" w:type="dxa"/>
+              <w:bottom w:w="60.0" w:type="dxa"/>
+              <w:right w:w="80.0" w:type="dxa"/>
+            </w:tcMar>
+            <w:vAlign w:val="top"/>
+          </w:tcPr>
+          <w:p>
+            <w:pPr>
+              <w:spacing w:after="0" w:line="240" w:lineRule="auto"/>
+              <w:jc w:val="left"/>
+              <w:rPr>
+                <w:sz w:val="20"/>
+                <w:szCs w:val="20"/>
+              </w:rPr>
+            </w:pPr>
+            <w:r>
+              <w:rPr>
+                <w:sz w:val="20"/>
+                <w:szCs w:val="20"/>
+                <w:rtl w:val="0"/>
+              </w:rPr>
+              <w:t xml:space="preserve">Paciente, valor, vencimento e situação financeira.</w:t>
+            </w:r>
+          </w:p>
+        </w:tc>
+        <w:tc>
+          <w:tcPr>
+            <w:tcBorders>
+              <w:top w:color="000000" w:space="0" w:sz="6" w:val="single"/>
+              <w:left w:color="000000" w:space="0" w:sz="6" w:val="single"/>
+              <w:bottom w:color="000000" w:space="0" w:sz="6" w:val="single"/>
+              <w:right w:color="000000" w:space="0" w:sz="6" w:val="single"/>
+            </w:tcBorders>
+            <w:tcMar>
+              <w:top w:w="60.0" w:type="dxa"/>
+              <w:left w:w="80.0" w:type="dxa"/>
+              <w:bottom w:w="60.0" w:type="dxa"/>
+              <w:right w:w="80.0" w:type="dxa"/>
+            </w:tcMar>
+            <w:vAlign w:val="top"/>
+          </w:tcPr>
+          <w:p>
+            <w:pPr>
+              <w:spacing w:after="0" w:line="240" w:lineRule="auto"/>
+              <w:jc w:val="left"/>
+              <w:rPr>
+                <w:sz w:val="20"/>
+                <w:szCs w:val="20"/>
+              </w:rPr>
+            </w:pPr>
+            <w:r>
+              <w:rPr>
+                <w:sz w:val="20"/>
+                <w:szCs w:val="20"/>
+                <w:rtl w:val="0"/>
+              </w:rPr>
+              <w:t xml:space="preserve">Controla a situação da obrigação, reconhece a quitação quando há confirmação válida e deixa às subclasses a descrição da referência.</w:t>
             </w:r>
           </w:p>
         </w:tc>
@@ -9151,6 +10108,370 @@
                 <w:rtl w:val="0"/>
               </w:rPr>
               <w:t xml:space="preserve">Paciente, Agendamento, Recorrência, Pagamento.</w:t>
+            </w:r>
+          </w:p>
+        </w:tc>
+      </w:tr>
+      <w:tr>
+        <w:trPr>
+          <w:cantSplit w:val="0"/>
+          <w:trHeight w:val="1530" w:hRule="atLeast"/>
+          <w:tblHeader w:val="0"/>
+        </w:trPr>
+        <w:tc>
+          <w:tcPr>
+            <w:tcBorders>
+              <w:top w:color="000000" w:space="0" w:sz="6" w:val="single"/>
+              <w:left w:color="000000" w:space="0" w:sz="6" w:val="single"/>
+              <w:bottom w:color="000000" w:space="0" w:sz="6" w:val="single"/>
+              <w:right w:color="000000" w:space="0" w:sz="6" w:val="single"/>
+            </w:tcBorders>
+            <w:tcMar>
+              <w:top w:w="60.0" w:type="dxa"/>
+              <w:left w:w="80.0" w:type="dxa"/>
+              <w:bottom w:w="60.0" w:type="dxa"/>
+              <w:right w:w="80.0" w:type="dxa"/>
+            </w:tcMar>
+            <w:vAlign w:val="top"/>
+          </w:tcPr>
+          <w:p>
+            <w:pPr>
+              <w:spacing w:after="0" w:line="240" w:lineRule="auto"/>
+              <w:jc w:val="left"/>
+              <w:rPr>
+                <w:sz w:val="20"/>
+                <w:szCs w:val="20"/>
+              </w:rPr>
+            </w:pPr>
+            <w:r>
+              <w:rPr>
+                <w:sz w:val="20"/>
+                <w:szCs w:val="20"/>
+                <w:rtl w:val="0"/>
+              </w:rPr>
+              <w:t xml:space="preserve">Cobrança Avulsa</w:t>
+            </w:r>
+          </w:p>
+        </w:tc>
+        <w:tc>
+          <w:tcPr>
+            <w:tcBorders>
+              <w:top w:color="000000" w:space="0" w:sz="6" w:val="single"/>
+              <w:left w:color="000000" w:space="0" w:sz="6" w:val="single"/>
+              <w:bottom w:color="000000" w:space="0" w:sz="6" w:val="single"/>
+              <w:right w:color="000000" w:space="0" w:sz="6" w:val="single"/>
+            </w:tcBorders>
+            <w:tcMar>
+              <w:top w:w="60.0" w:type="dxa"/>
+              <w:left w:w="80.0" w:type="dxa"/>
+              <w:bottom w:w="60.0" w:type="dxa"/>
+              <w:right w:w="80.0" w:type="dxa"/>
+            </w:tcMar>
+            <w:vAlign w:val="top"/>
+          </w:tcPr>
+          <w:p>
+            <w:pPr>
+              <w:spacing w:after="0" w:line="240" w:lineRule="auto"/>
+              <w:jc w:val="left"/>
+              <w:rPr>
+                <w:sz w:val="20"/>
+                <w:szCs w:val="20"/>
+              </w:rPr>
+            </w:pPr>
+            <w:r>
+              <w:rPr>
+                <w:sz w:val="20"/>
+                <w:szCs w:val="20"/>
+                <w:rtl w:val="0"/>
+              </w:rPr>
+              <w:t xml:space="preserve">Representar a cobrança de uma consulta específica.</w:t>
+            </w:r>
+          </w:p>
+        </w:tc>
+        <w:tc>
+          <w:tcPr>
+            <w:tcBorders>
+              <w:top w:color="000000" w:space="0" w:sz="6" w:val="single"/>
+              <w:left w:color="000000" w:space="0" w:sz="6" w:val="single"/>
+              <w:bottom w:color="000000" w:space="0" w:sz="6" w:val="single"/>
+              <w:right w:color="000000" w:space="0" w:sz="6" w:val="single"/>
+            </w:tcBorders>
+            <w:tcMar>
+              <w:top w:w="60.0" w:type="dxa"/>
+              <w:left w:w="80.0" w:type="dxa"/>
+              <w:bottom w:w="60.0" w:type="dxa"/>
+              <w:right w:w="80.0" w:type="dxa"/>
+            </w:tcMar>
+            <w:vAlign w:val="top"/>
+          </w:tcPr>
+          <w:p>
+            <w:pPr>
+              <w:spacing w:after="0" w:line="240" w:lineRule="auto"/>
+              <w:jc w:val="left"/>
+              <w:rPr>
+                <w:sz w:val="20"/>
+                <w:szCs w:val="20"/>
+              </w:rPr>
+            </w:pPr>
+            <w:r>
+              <w:rPr>
+                <w:sz w:val="20"/>
+                <w:szCs w:val="20"/>
+                <w:rtl w:val="0"/>
+              </w:rPr>
+              <w:t xml:space="preserve">Agendamento de origem e data da consulta.</w:t>
+            </w:r>
+          </w:p>
+        </w:tc>
+        <w:tc>
+          <w:tcPr>
+            <w:tcBorders>
+              <w:top w:color="000000" w:space="0" w:sz="6" w:val="single"/>
+              <w:left w:color="000000" w:space="0" w:sz="6" w:val="single"/>
+              <w:bottom w:color="000000" w:space="0" w:sz="6" w:val="single"/>
+              <w:right w:color="000000" w:space="0" w:sz="6" w:val="single"/>
+            </w:tcBorders>
+            <w:tcMar>
+              <w:top w:w="60.0" w:type="dxa"/>
+              <w:left w:w="80.0" w:type="dxa"/>
+              <w:bottom w:w="60.0" w:type="dxa"/>
+              <w:right w:w="80.0" w:type="dxa"/>
+            </w:tcMar>
+            <w:vAlign w:val="top"/>
+          </w:tcPr>
+          <w:p>
+            <w:pPr>
+              <w:spacing w:after="0" w:line="240" w:lineRule="auto"/>
+              <w:jc w:val="left"/>
+              <w:rPr>
+                <w:sz w:val="20"/>
+                <w:szCs w:val="20"/>
+              </w:rPr>
+            </w:pPr>
+            <w:r>
+              <w:rPr>
+                <w:sz w:val="20"/>
+                <w:szCs w:val="20"/>
+                <w:rtl w:val="0"/>
+              </w:rPr>
+              <w:t xml:space="preserve">Descreve a referência da cobrança pela consulta.</w:t>
+            </w:r>
+          </w:p>
+        </w:tc>
+        <w:tc>
+          <w:tcPr>
+            <w:tcBorders>
+              <w:top w:color="000000" w:space="0" w:sz="6" w:val="single"/>
+              <w:left w:color="000000" w:space="0" w:sz="6" w:val="single"/>
+              <w:bottom w:color="000000" w:space="0" w:sz="6" w:val="single"/>
+              <w:right w:color="000000" w:space="0" w:sz="6" w:val="single"/>
+            </w:tcBorders>
+            <w:tcMar>
+              <w:top w:w="60.0" w:type="dxa"/>
+              <w:left w:w="80.0" w:type="dxa"/>
+              <w:bottom w:w="60.0" w:type="dxa"/>
+              <w:right w:w="80.0" w:type="dxa"/>
+            </w:tcMar>
+            <w:vAlign w:val="top"/>
+          </w:tcPr>
+          <w:p>
+            <w:pPr>
+              <w:spacing w:after="0" w:line="240" w:lineRule="auto"/>
+              <w:jc w:val="left"/>
+              <w:rPr>
+                <w:sz w:val="20"/>
+                <w:szCs w:val="20"/>
+              </w:rPr>
+            </w:pPr>
+            <w:r>
+              <w:rPr>
+                <w:sz w:val="20"/>
+                <w:szCs w:val="20"/>
+                <w:rtl w:val="0"/>
+              </w:rPr>
+              <w:t xml:space="preserve">Cobrança, Agendamento.</w:t>
+            </w:r>
+          </w:p>
+        </w:tc>
+      </w:tr>
+      <w:tr>
+        <w:trPr>
+          <w:cantSplit w:val="0"/>
+          <w:trHeight w:val="1530" w:hRule="atLeast"/>
+          <w:tblHeader w:val="0"/>
+        </w:trPr>
+        <w:tc>
+          <w:tcPr>
+            <w:tcBorders>
+              <w:top w:color="000000" w:space="0" w:sz="6" w:val="single"/>
+              <w:left w:color="000000" w:space="0" w:sz="6" w:val="single"/>
+              <w:bottom w:color="000000" w:space="0" w:sz="6" w:val="single"/>
+              <w:right w:color="000000" w:space="0" w:sz="6" w:val="single"/>
+            </w:tcBorders>
+            <w:tcMar>
+              <w:top w:w="60.0" w:type="dxa"/>
+              <w:left w:w="80.0" w:type="dxa"/>
+              <w:bottom w:w="60.0" w:type="dxa"/>
+              <w:right w:w="80.0" w:type="dxa"/>
+            </w:tcMar>
+            <w:vAlign w:val="top"/>
+          </w:tcPr>
+          <w:p>
+            <w:pPr>
+              <w:spacing w:after="0" w:line="240" w:lineRule="auto"/>
+              <w:jc w:val="left"/>
+              <w:rPr>
+                <w:sz w:val="20"/>
+                <w:szCs w:val="20"/>
+              </w:rPr>
+            </w:pPr>
+            <w:r>
+              <w:rPr>
+                <w:sz w:val="20"/>
+                <w:szCs w:val="20"/>
+                <w:rtl w:val="0"/>
+              </w:rPr>
+              <w:t xml:space="preserve">Mensalidade</w:t>
+            </w:r>
+          </w:p>
+        </w:tc>
+        <w:tc>
+          <w:tcPr>
+            <w:tcBorders>
+              <w:top w:color="000000" w:space="0" w:sz="6" w:val="single"/>
+              <w:left w:color="000000" w:space="0" w:sz="6" w:val="single"/>
+              <w:bottom w:color="000000" w:space="0" w:sz="6" w:val="single"/>
+              <w:right w:color="000000" w:space="0" w:sz="6" w:val="single"/>
+            </w:tcBorders>
+            <w:tcMar>
+              <w:top w:w="60.0" w:type="dxa"/>
+              <w:left w:w="80.0" w:type="dxa"/>
+              <w:bottom w:w="60.0" w:type="dxa"/>
+              <w:right w:w="80.0" w:type="dxa"/>
+            </w:tcMar>
+            <w:vAlign w:val="top"/>
+          </w:tcPr>
+          <w:p>
+            <w:pPr>
+              <w:spacing w:after="0" w:line="240" w:lineRule="auto"/>
+              <w:jc w:val="left"/>
+              <w:rPr>
+                <w:sz w:val="20"/>
+                <w:szCs w:val="20"/>
+              </w:rPr>
+            </w:pPr>
+            <w:r>
+              <w:rPr>
+                <w:sz w:val="20"/>
+                <w:szCs w:val="20"/>
+                <w:rtl w:val="0"/>
+              </w:rPr>
+              <w:t xml:space="preserve">Representar a cobrança de valor fixo de uma recorrência.</w:t>
+            </w:r>
+          </w:p>
+        </w:tc>
+        <w:tc>
+          <w:tcPr>
+            <w:tcBorders>
+              <w:top w:color="000000" w:space="0" w:sz="6" w:val="single"/>
+              <w:left w:color="000000" w:space="0" w:sz="6" w:val="single"/>
+              <w:bottom w:color="000000" w:space="0" w:sz="6" w:val="single"/>
+              <w:right w:color="000000" w:space="0" w:sz="6" w:val="single"/>
+            </w:tcBorders>
+            <w:tcMar>
+              <w:top w:w="60.0" w:type="dxa"/>
+              <w:left w:w="80.0" w:type="dxa"/>
+              <w:bottom w:w="60.0" w:type="dxa"/>
+              <w:right w:w="80.0" w:type="dxa"/>
+            </w:tcMar>
+            <w:vAlign w:val="top"/>
+          </w:tcPr>
+          <w:p>
+            <w:pPr>
+              <w:spacing w:after="0" w:line="240" w:lineRule="auto"/>
+              <w:jc w:val="left"/>
+              <w:rPr>
+                <w:sz w:val="20"/>
+                <w:szCs w:val="20"/>
+              </w:rPr>
+            </w:pPr>
+            <w:r>
+              <w:rPr>
+                <w:sz w:val="20"/>
+                <w:szCs w:val="20"/>
+                <w:rtl w:val="0"/>
+              </w:rPr>
+              <w:t xml:space="preserve">Recorrência e competência (mês de referência).</w:t>
+            </w:r>
+          </w:p>
+        </w:tc>
+        <w:tc>
+          <w:tcPr>
+            <w:tcBorders>
+              <w:top w:color="000000" w:space="0" w:sz="6" w:val="single"/>
+              <w:left w:color="000000" w:space="0" w:sz="6" w:val="single"/>
+              <w:bottom w:color="000000" w:space="0" w:sz="6" w:val="single"/>
+              <w:right w:color="000000" w:space="0" w:sz="6" w:val="single"/>
+            </w:tcBorders>
+            <w:tcMar>
+              <w:top w:w="60.0" w:type="dxa"/>
+              <w:left w:w="80.0" w:type="dxa"/>
+              <w:bottom w:w="60.0" w:type="dxa"/>
+              <w:right w:w="80.0" w:type="dxa"/>
+            </w:tcMar>
+            <w:vAlign w:val="top"/>
+          </w:tcPr>
+          <w:p>
+            <w:pPr>
+              <w:spacing w:after="0" w:line="240" w:lineRule="auto"/>
+              <w:jc w:val="left"/>
+              <w:rPr>
+                <w:sz w:val="20"/>
+                <w:szCs w:val="20"/>
+              </w:rPr>
+            </w:pPr>
+            <w:r>
+              <w:rPr>
+                <w:sz w:val="20"/>
+                <w:szCs w:val="20"/>
+                <w:rtl w:val="0"/>
+              </w:rPr>
+              <w:t xml:space="preserve">Descreve a referência da cobrança pela competência.</w:t>
+            </w:r>
+          </w:p>
+        </w:tc>
+        <w:tc>
+          <w:tcPr>
+            <w:tcBorders>
+              <w:top w:color="000000" w:space="0" w:sz="6" w:val="single"/>
+              <w:left w:color="000000" w:space="0" w:sz="6" w:val="single"/>
+              <w:bottom w:color="000000" w:space="0" w:sz="6" w:val="single"/>
+              <w:right w:color="000000" w:space="0" w:sz="6" w:val="single"/>
+            </w:tcBorders>
+            <w:tcMar>
+              <w:top w:w="60.0" w:type="dxa"/>
+              <w:left w:w="80.0" w:type="dxa"/>
+              <w:bottom w:w="60.0" w:type="dxa"/>
+              <w:right w:w="80.0" w:type="dxa"/>
+            </w:tcMar>
+            <w:vAlign w:val="top"/>
+          </w:tcPr>
+          <w:p>
+            <w:pPr>
+              <w:spacing w:after="0" w:line="240" w:lineRule="auto"/>
+              <w:jc w:val="left"/>
+              <w:rPr>
+                <w:sz w:val="20"/>
+                <w:szCs w:val="20"/>
+              </w:rPr>
+            </w:pPr>
+            <w:r>
+              <w:rPr>
+                <w:sz w:val="20"/>
+                <w:szCs w:val="20"/>
+                <w:rtl w:val="0"/>
+              </w:rPr>
+              <w:t xml:space="preserve">Cobrança, Recorrência.</w:t>
             </w:r>
           </w:p>
         </w:tc>
@@ -9262,7 +10583,7 @@
                 <w:szCs w:val="20"/>
                 <w:rtl w:val="0"/>
               </w:rPr>
-              <w:t xml:space="preserve">Cobrança, valor confirmado, modalidade, data e referência da transação.</w:t>
+              <w:t xml:space="preserve">Cobrança, valor confirmado, forma de pagamento, data e referência da transação.</w:t>
             </w:r>
           </w:p>
         </w:tc>
@@ -9444,7 +10765,7 @@
                 <w:szCs w:val="20"/>
                 <w:rtl w:val="0"/>
               </w:rPr>
-              <w:t xml:space="preserve">Cobrança, modalidade, referência externa e situação da tentativa.</w:t>
+              <w:t xml:space="preserve">Cobrança, forma de pagamento, referência externa e situação da tentativa.</w:t>
             </w:r>
           </w:p>
         </w:tc>
@@ -9556,7 +10877,7 @@
         <w:rPr>
           <w:rtl w:val="0"/>
         </w:rPr>
-        <w:t xml:space="preserve"> separar Cobrança, Pagamento e Tentativa de Pagamento impede que uma tentativa recusada ou pendente seja tratada como quitação. A comunicação com o serviço externo de pagamento fica com um componente de integração, e não com as entidades financeiras.</w:t>
+        <w:t xml:space="preserve"> separar Cobrança, Pagamento e Tentativa de Pagamento impede que uma tentativa recusada ou pendente seja tratada como quitação. A comunicação com o serviço externo de pagamento fica com um componente de integração, e não com as entidades financeiras. Cobrança Avulsa e Mensalidade especializam Cobrança, o que substitui a antiga restrição de origem exclusiva e permite tratar qualquer cobrança da mesma forma.</w:t>
       </w:r>
     </w:p>
     <w:p>
@@ -9570,7 +10891,7 @@
           <w:szCs w:val="24"/>
         </w:rPr>
       </w:pPr>
-      <w:bookmarkStart w:colFirst="0" w:colLast="0" w:name="_n92ylc8xxf5d" w:id="22"/>
+      <w:bookmarkStart w:colFirst="0" w:colLast="0" w:name="_vdiwe0an20an" w:id="22"/>
       <w:bookmarkEnd w:id="22"/>
       <w:r>
         <w:rPr>
@@ -10435,7 +11756,7 @@
           <w:szCs w:val="24"/>
         </w:rPr>
       </w:pPr>
-      <w:bookmarkStart w:colFirst="0" w:colLast="0" w:name="_zmygg51ueqn" w:id="23"/>
+      <w:bookmarkStart w:colFirst="0" w:colLast="0" w:name="_o0z114i5bydg" w:id="23"/>
       <w:bookmarkEnd w:id="23"/>
       <w:r>
         <w:rPr>
@@ -11300,7 +12621,7 @@
           <w:szCs w:val="24"/>
         </w:rPr>
       </w:pPr>
-      <w:bookmarkStart w:colFirst="0" w:colLast="0" w:name="_k7j183vvex8l" w:id="24"/>
+      <w:bookmarkStart w:colFirst="0" w:colLast="0" w:name="_8rzaqyyn0qbg" w:id="24"/>
       <w:bookmarkEnd w:id="24"/>
       <w:r>
         <w:rPr>
@@ -11675,7 +12996,7 @@
                 <w:szCs w:val="20"/>
                 <w:rtl w:val="0"/>
               </w:rPr>
-              <w:t xml:space="preserve">Destinatário, tipo de mensagem, conteúdo permitido, data e situação de envio.</w:t>
+              <w:t xml:space="preserve">Destinatário (usuário ou destinatário externo), tipo de mensagem, conteúdo permitido, data e situação de envio.</w:t>
             </w:r>
           </w:p>
         </w:tc>
@@ -11745,7 +13066,7 @@
                 <w:szCs w:val="20"/>
                 <w:rtl w:val="0"/>
               </w:rPr>
-              <w:t xml:space="preserve">Usuário, Oferta de Encaixe, Compartilhamento de Documento.</w:t>
+              <w:t xml:space="preserve">Usuário, Destinatário de Compartilhamento, Oferta de Encaixe, Compartilhamento de Documento.</w:t>
             </w:r>
           </w:p>
         </w:tc>
@@ -11985,7 +13306,7 @@
           <w:szCs w:val="24"/>
         </w:rPr>
       </w:pPr>
-      <w:bookmarkStart w:colFirst="0" w:colLast="0" w:name="_wkc2kx50bdke" w:id="25"/>
+      <w:bookmarkStart w:colFirst="0" w:colLast="0" w:name="_5yx0bcw8sczo" w:id="25"/>
       <w:bookmarkEnd w:id="25"/>
       <w:r>
         <w:rPr>
@@ -12018,14 +13339,15 @@
           <w:numId w:val="3"/>
         </w:numPr>
         <w:pBdr>
-          <w:top w:color="auto" w:space="0" w:sz="0" w:val="none"/>
-          <w:bottom w:color="auto" w:space="0" w:sz="0" w:val="none"/>
-          <w:right w:color="auto" w:space="0" w:sz="0" w:val="none"/>
-          <w:between w:color="auto" w:space="0" w:sz="0" w:val="none"/>
+          <w:top w:color="000000" w:space="0" w:sz="0" w:val="none"/>
+          <w:bottom w:color="000000" w:space="0" w:sz="0" w:val="none"/>
+          <w:right w:color="000000" w:space="0" w:sz="0" w:val="none"/>
+          <w:between w:color="000000" w:space="0" w:sz="0" w:val="none"/>
         </w:pBdr>
         <w:spacing w:after="0" w:lineRule="auto"/>
         <w:ind w:left="720" w:hanging="360"/>
         <w:jc w:val="left"/>
+        <w:rPr/>
       </w:pPr>
       <w:r>
         <w:rPr>
@@ -12049,14 +13371,15 @@
           <w:numId w:val="3"/>
         </w:numPr>
         <w:pBdr>
-          <w:top w:color="auto" w:space="0" w:sz="0" w:val="none"/>
-          <w:bottom w:color="auto" w:space="0" w:sz="0" w:val="none"/>
-          <w:right w:color="auto" w:space="0" w:sz="0" w:val="none"/>
-          <w:between w:color="auto" w:space="0" w:sz="0" w:val="none"/>
+          <w:top w:color="000000" w:space="0" w:sz="0" w:val="none"/>
+          <w:bottom w:color="000000" w:space="0" w:sz="0" w:val="none"/>
+          <w:right w:color="000000" w:space="0" w:sz="0" w:val="none"/>
+          <w:between w:color="000000" w:space="0" w:sz="0" w:val="none"/>
         </w:pBdr>
         <w:spacing w:after="0" w:lineRule="auto"/>
         <w:ind w:left="720" w:hanging="360"/>
         <w:jc w:val="left"/>
+        <w:rPr/>
       </w:pPr>
       <w:r>
         <w:rPr>
@@ -12080,14 +13403,15 @@
           <w:numId w:val="3"/>
         </w:numPr>
         <w:pBdr>
-          <w:top w:color="auto" w:space="0" w:sz="0" w:val="none"/>
-          <w:bottom w:color="auto" w:space="0" w:sz="0" w:val="none"/>
-          <w:right w:color="auto" w:space="0" w:sz="0" w:val="none"/>
-          <w:between w:color="auto" w:space="0" w:sz="0" w:val="none"/>
+          <w:top w:color="000000" w:space="0" w:sz="0" w:val="none"/>
+          <w:bottom w:color="000000" w:space="0" w:sz="0" w:val="none"/>
+          <w:right w:color="000000" w:space="0" w:sz="0" w:val="none"/>
+          <w:between w:color="000000" w:space="0" w:sz="0" w:val="none"/>
         </w:pBdr>
         <w:spacing w:after="0" w:lineRule="auto"/>
         <w:ind w:left="720" w:hanging="360"/>
         <w:jc w:val="left"/>
+        <w:rPr/>
       </w:pPr>
       <w:r>
         <w:rPr>
@@ -12111,14 +13435,15 @@
           <w:numId w:val="3"/>
         </w:numPr>
         <w:pBdr>
-          <w:top w:color="auto" w:space="0" w:sz="0" w:val="none"/>
-          <w:bottom w:color="auto" w:space="0" w:sz="0" w:val="none"/>
-          <w:right w:color="auto" w:space="0" w:sz="0" w:val="none"/>
-          <w:between w:color="auto" w:space="0" w:sz="0" w:val="none"/>
+          <w:top w:color="000000" w:space="0" w:sz="0" w:val="none"/>
+          <w:bottom w:color="000000" w:space="0" w:sz="0" w:val="none"/>
+          <w:right w:color="000000" w:space="0" w:sz="0" w:val="none"/>
+          <w:between w:color="000000" w:space="0" w:sz="0" w:val="none"/>
         </w:pBdr>
         <w:spacing w:after="0" w:lineRule="auto"/>
         <w:ind w:left="720" w:hanging="360"/>
         <w:jc w:val="left"/>
+        <w:rPr/>
       </w:pPr>
       <w:r>
         <w:rPr>
@@ -12142,14 +13467,15 @@
           <w:numId w:val="3"/>
         </w:numPr>
         <w:pBdr>
-          <w:top w:color="auto" w:space="0" w:sz="0" w:val="none"/>
-          <w:bottom w:color="auto" w:space="0" w:sz="0" w:val="none"/>
-          <w:right w:color="auto" w:space="0" w:sz="0" w:val="none"/>
-          <w:between w:color="auto" w:space="0" w:sz="0" w:val="none"/>
+          <w:top w:color="000000" w:space="0" w:sz="0" w:val="none"/>
+          <w:bottom w:color="000000" w:space="0" w:sz="0" w:val="none"/>
+          <w:right w:color="000000" w:space="0" w:sz="0" w:val="none"/>
+          <w:between w:color="000000" w:space="0" w:sz="0" w:val="none"/>
         </w:pBdr>
         <w:spacing w:after="0" w:lineRule="auto"/>
         <w:ind w:left="720" w:hanging="360"/>
         <w:jc w:val="left"/>
+        <w:rPr/>
       </w:pPr>
       <w:r>
         <w:rPr>
@@ -12179,7 +13505,7 @@
           <w:szCs w:val="24"/>
         </w:rPr>
       </w:pPr>
-      <w:bookmarkStart w:colFirst="0" w:colLast="0" w:name="_7vwu857ygi3j" w:id="26"/>
+      <w:bookmarkStart w:colFirst="0" w:colLast="0" w:name="_nmaufdwu7vk" w:id="26"/>
       <w:bookmarkEnd w:id="26"/>
       <w:r>
         <w:rPr>
@@ -12223,7 +13549,7 @@
         <w:pStyle w:val="Heading1"/>
         <w:rPr/>
       </w:pPr>
-      <w:bookmarkStart w:colFirst="0" w:colLast="0" w:name="_fov2ffpgsh30" w:id="27"/>
+      <w:bookmarkStart w:colFirst="0" w:colLast="0" w:name="_1vuj94w5wm9" w:id="27"/>
       <w:bookmarkEnd w:id="27"/>
       <w:r>
         <w:rPr>
@@ -12242,6 +13568,18 @@
           <w:rtl w:val="0"/>
         </w:rPr>
         <w:t xml:space="preserve">O diagrama de classes apresenta a estrutura do domínio da plataforma Nexo, incluindo as classes identificadas, seus atributos, operações e relacionamentos. A modelagem foi desenvolvida com base nos conceitos e nas responsabilidades definidos nas seções anteriores.</w:t>
+      </w:r>
+    </w:p>
+    <w:p>
+      <w:pPr>
+        <w:ind w:left="0" w:firstLine="708.6614173228347"/>
+        <w:rPr/>
+      </w:pPr>
+      <w:r>
+        <w:rPr>
+          <w:rtl w:val="0"/>
+        </w:rPr>
+        <w:t xml:space="preserve">O modelo foi dividido em nove áreas, uma por figura, para manter cada diagrama legível. As classes em cinza são referências a classes detalhadas em outra área; as caixas «enumeration» definem os valores permitidos para os atributos de situação; as multiplicidades aparecem nas duas pontas de cada associação; o losango cheio indica composição, o vazio indica agregação e o triângulo vazio indica generalização.</w:t>
       </w:r>
     </w:p>
     <w:p>
@@ -12279,14 +13617,14 @@
         </w:rPr>
         <w:drawing>
           <wp:inline distB="114300" distT="114300" distL="114300" distR="114300">
-            <wp:extent cx="3837642" cy="2652713"/>
+            <wp:extent cx="5760000" cy="2628900"/>
             <wp:effectExtent b="0" l="0" r="0" t="0"/>
-            <wp:docPr id="5" name="image1.png"/>
+            <wp:docPr id="10" name="image10.png"/>
             <a:graphic>
               <a:graphicData uri="http://schemas.openxmlformats.org/drawingml/2006/picture">
                 <pic:pic>
                   <pic:nvPicPr>
-                    <pic:cNvPr id="0" name="image1.png"/>
+                    <pic:cNvPr id="0" name="image10.png"/>
                     <pic:cNvPicPr preferRelativeResize="0"/>
                   </pic:nvPicPr>
                   <pic:blipFill>
@@ -12299,7 +13637,7 @@
                   <pic:spPr>
                     <a:xfrm>
                       <a:off x="0" y="0"/>
-                      <a:ext cx="3837642" cy="2652713"/>
+                      <a:ext cx="5760000" cy="2628900"/>
                     </a:xfrm>
                     <a:prstGeom prst="rect"/>
                     <a:ln/>
@@ -12336,6 +13674,26 @@
     </w:p>
     <w:p>
       <w:pPr>
+        <w:ind w:left="0" w:firstLine="708.6614173228347"/>
+        <w:rPr/>
+      </w:pPr>
+      <w:r>
+        <w:rPr>
+          <w:b w:val="1"/>
+          <w:bCs w:val="1"/>
+          <w:rtl w:val="0"/>
+        </w:rPr>
+        <w:t xml:space="preserve">Leitura:</w:t>
+      </w:r>
+      <w:r>
+        <w:rPr>
+          <w:rtl w:val="0"/>
+        </w:rPr>
+        <w:t xml:space="preserve"> A figura mostra como o Nexo separa identidade e autorização. Cada Usuário tem exatamente um Perfil de Acesso, e o Perfil agrega Permissões que podem ser compartilhadas entre perfis. A situação da conta usa a enumeração SituaçãoConta, e a senha existe apenas como senhaHash, atendendo ao RNF-003. Relaciona-se aos casos de uso UC-001 a UC-011.</w:t>
+      </w:r>
+    </w:p>
+    <w:p>
+      <w:pPr>
         <w:keepNext w:val="1"/>
         <w:spacing w:after="120" w:before="120" w:line="240" w:lineRule="auto"/>
         <w:jc w:val="center"/>
@@ -12369,14 +13727,14 @@
         </w:rPr>
         <w:drawing>
           <wp:inline distB="114300" distT="114300" distL="114300" distR="114300">
-            <wp:extent cx="3852863" cy="2662443"/>
+            <wp:extent cx="5750000" cy="3694241"/>
             <wp:effectExtent b="0" l="0" r="0" t="0"/>
-            <wp:docPr id="2" name="image3.png"/>
+            <wp:docPr id="2" name="image6.png"/>
             <a:graphic>
               <a:graphicData uri="http://schemas.openxmlformats.org/drawingml/2006/picture">
                 <pic:pic>
                   <pic:nvPicPr>
-                    <pic:cNvPr id="0" name="image3.png"/>
+                    <pic:cNvPr id="0" name="image6.png"/>
                     <pic:cNvPicPr preferRelativeResize="0"/>
                   </pic:nvPicPr>
                   <pic:blipFill>
@@ -12389,7 +13747,7 @@
                   <pic:spPr>
                     <a:xfrm>
                       <a:off x="0" y="0"/>
-                      <a:ext cx="3852863" cy="2662443"/>
+                      <a:ext cx="5750000" cy="3694241"/>
                     </a:xfrm>
                     <a:prstGeom prst="rect"/>
                     <a:ln/>
@@ -12426,6 +13784,26 @@
     </w:p>
     <w:p>
       <w:pPr>
+        <w:ind w:left="0" w:firstLine="708.6614173228347"/>
+        <w:rPr/>
+      </w:pPr>
+      <w:r>
+        <w:rPr>
+          <w:b w:val="1"/>
+          <w:bCs w:val="1"/>
+          <w:rtl w:val="0"/>
+        </w:rPr>
+        <w:t xml:space="preserve">Leitura:</w:t>
+      </w:r>
+      <w:r>
+        <w:rPr>
+          <w:rtl w:val="0"/>
+        </w:rPr>
+        <w:t xml:space="preserve"> O Paciente tem no máximo uma conta (0..1 nas duas pontas), o que permite cadastrá-lo sem acesso próprio e ativar a conta depois (RN-033, RN-038). O papel de Responsável aparece como Vínculo de Responsabilidade entre um Usuário e um Paciente, com permissões próprias por vínculo. O Psicólogo se liga ao catálogo de Áreas de Atuação (muitos para muitos), o que deixa o modelo adaptável às diferentes áreas da Psicologia. Relaciona-se aos UC-015 a UC-022.</w:t>
+      </w:r>
+    </w:p>
+    <w:p>
+      <w:pPr>
         <w:keepNext w:val="1"/>
         <w:spacing w:after="120" w:before="120" w:line="240" w:lineRule="auto"/>
         <w:jc w:val="center"/>
@@ -12459,14 +13837,14 @@
         </w:rPr>
         <w:drawing>
           <wp:inline distB="114300" distT="114300" distL="114300" distR="114300">
-            <wp:extent cx="3871340" cy="2675212"/>
+            <wp:extent cx="5750000" cy="3311418"/>
             <wp:effectExtent b="0" l="0" r="0" t="0"/>
-            <wp:docPr id="1" name="image6.png"/>
+            <wp:docPr id="1" name="image9.png"/>
             <a:graphic>
               <a:graphicData uri="http://schemas.openxmlformats.org/drawingml/2006/picture">
                 <pic:pic>
                   <pic:nvPicPr>
-                    <pic:cNvPr id="0" name="image6.png"/>
+                    <pic:cNvPr id="0" name="image9.png"/>
                     <pic:cNvPicPr preferRelativeResize="0"/>
                   </pic:nvPicPr>
                   <pic:blipFill>
@@ -12479,7 +13857,7 @@
                   <pic:spPr>
                     <a:xfrm>
                       <a:off x="0" y="0"/>
-                      <a:ext cx="3871340" cy="2675212"/>
+                      <a:ext cx="5750000" cy="3311418"/>
                     </a:xfrm>
                     <a:prstGeom prst="rect"/>
                     <a:ln/>
@@ -12516,6 +13894,26 @@
     </w:p>
     <w:p>
       <w:pPr>
+        <w:ind w:left="0" w:firstLine="708.6614173228347"/>
+        <w:rPr/>
+      </w:pPr>
+      <w:r>
+        <w:rPr>
+          <w:b w:val="1"/>
+          <w:bCs w:val="1"/>
+          <w:rtl w:val="0"/>
+        </w:rPr>
+        <w:t xml:space="preserve">Leitura:</w:t>
+      </w:r>
+      <w:r>
+        <w:rPr>
+          <w:rtl w:val="0"/>
+        </w:rPr>
+        <w:t xml:space="preserve"> Disponibilidade e Bloqueio de Agenda pertencem a um Psicólogo e definem os horários que podem ser oferecidos. Cada Agendamento liga exatamente um Paciente e um Psicólogo e pode ser ocorrência de uma Recorrência (0..1). A autoassociação "reagendado como" preserva a consulta original no reagendamento. As mudanças de situação usam operações específicas, como confirmar(), cancelar() e reagendar(), que servem de base para a máquina de estados. Relaciona-se aos UC-023 a UC-031.</w:t>
+      </w:r>
+    </w:p>
+    <w:p>
+      <w:pPr>
         <w:keepNext w:val="1"/>
         <w:spacing w:after="120" w:before="120" w:line="240" w:lineRule="auto"/>
         <w:jc w:val="center"/>
@@ -12549,14 +13947,14 @@
         </w:rPr>
         <w:drawing>
           <wp:inline distB="114300" distT="114300" distL="114300" distR="114300">
-            <wp:extent cx="3871913" cy="2675712"/>
+            <wp:extent cx="5750000" cy="3000810"/>
             <wp:effectExtent b="0" l="0" r="0" t="0"/>
-            <wp:docPr id="8" name="image10.png"/>
+            <wp:docPr id="4" name="image3.png"/>
             <a:graphic>
               <a:graphicData uri="http://schemas.openxmlformats.org/drawingml/2006/picture">
                 <pic:pic>
                   <pic:nvPicPr>
-                    <pic:cNvPr id="0" name="image10.png"/>
+                    <pic:cNvPr id="0" name="image3.png"/>
                     <pic:cNvPicPr preferRelativeResize="0"/>
                   </pic:nvPicPr>
                   <pic:blipFill>
@@ -12569,7 +13967,7 @@
                   <pic:spPr>
                     <a:xfrm>
                       <a:off x="0" y="0"/>
-                      <a:ext cx="3871913" cy="2675712"/>
+                      <a:ext cx="5750000" cy="3000810"/>
                     </a:xfrm>
                     <a:prstGeom prst="rect"/>
                     <a:ln/>
@@ -12606,6 +14004,26 @@
     </w:p>
     <w:p>
       <w:pPr>
+        <w:ind w:left="0" w:firstLine="708.6614173228347"/>
+        <w:rPr/>
+      </w:pPr>
+      <w:r>
+        <w:rPr>
+          <w:b w:val="1"/>
+          <w:bCs w:val="1"/>
+          <w:rtl w:val="0"/>
+        </w:rPr>
+        <w:t xml:space="preserve">Leitura:</w:t>
+      </w:r>
+      <w:r>
+        <w:rPr>
+          <w:rtl w:val="0"/>
+        </w:rPr>
+        <w:t xml:space="preserve"> O Atendimento registra a consulta realizada e pode existir sem Agendamento (0..1). A Evolução Clínica pertence a um Paciente e a um Psicólogo autor e é composta por Versões: cada revisão cria uma nova versão, e as anteriores não são apagadas (RF-040, RN-028). Relaciona-se aos UC-032 a UC-035.</w:t>
+      </w:r>
+    </w:p>
+    <w:p>
+      <w:pPr>
         <w:keepNext w:val="1"/>
         <w:spacing w:after="120" w:before="120" w:line="240" w:lineRule="auto"/>
         <w:jc w:val="center"/>
@@ -12639,14 +14057,14 @@
         </w:rPr>
         <w:drawing>
           <wp:inline distB="114300" distT="114300" distL="114300" distR="114300">
-            <wp:extent cx="3866349" cy="2671763"/>
+            <wp:extent cx="5750000" cy="2622336"/>
             <wp:effectExtent b="0" l="0" r="0" t="0"/>
-            <wp:docPr id="9" name="image9.png"/>
+            <wp:docPr id="3" name="image2.png"/>
             <a:graphic>
               <a:graphicData uri="http://schemas.openxmlformats.org/drawingml/2006/picture">
                 <pic:pic>
                   <pic:nvPicPr>
-                    <pic:cNvPr id="0" name="image9.png"/>
+                    <pic:cNvPr id="0" name="image2.png"/>
                     <pic:cNvPicPr preferRelativeResize="0"/>
                   </pic:nvPicPr>
                   <pic:blipFill>
@@ -12659,7 +14077,7 @@
                   <pic:spPr>
                     <a:xfrm>
                       <a:off x="0" y="0"/>
-                      <a:ext cx="3866349" cy="2671763"/>
+                      <a:ext cx="5750000" cy="2622336"/>
                     </a:xfrm>
                     <a:prstGeom prst="rect"/>
                     <a:ln/>
@@ -12696,6 +14114,26 @@
     </w:p>
     <w:p>
       <w:pPr>
+        <w:ind w:left="0" w:firstLine="708.6614173228347"/>
+        <w:rPr/>
+      </w:pPr>
+      <w:r>
+        <w:rPr>
+          <w:b w:val="1"/>
+          <w:bCs w:val="1"/>
+          <w:rtl w:val="0"/>
+        </w:rPr>
+        <w:t xml:space="preserve">Leitura:</w:t>
+      </w:r>
+      <w:r>
+        <w:rPr>
+          <w:rtl w:val="0"/>
+        </w:rPr>
+        <w:t xml:space="preserve"> A Recorrência representa o acordo periódico entre um Paciente e um Psicólogo, com periodicidade, dia, horário e vigência. Ela materializa zero ou mais Agendamentos, gerados sete dias antes de cada data (RN-049). Relaciona-se aos UC-038 a UC-040.</w:t>
+      </w:r>
+    </w:p>
+    <w:p>
+      <w:pPr>
         <w:keepNext w:val="1"/>
         <w:spacing w:after="120" w:before="120" w:line="240" w:lineRule="auto"/>
         <w:jc w:val="center"/>
@@ -12729,14 +14167,14 @@
         </w:rPr>
         <w:drawing>
           <wp:inline distB="114300" distT="114300" distL="114300" distR="114300">
-            <wp:extent cx="3869647" cy="2770462"/>
+            <wp:extent cx="5750000" cy="3770805"/>
             <wp:effectExtent b="0" l="0" r="0" t="0"/>
-            <wp:docPr id="7" name="image5.png"/>
+            <wp:docPr id="6" name="image7.png"/>
             <a:graphic>
               <a:graphicData uri="http://schemas.openxmlformats.org/drawingml/2006/picture">
                 <pic:pic>
                   <pic:nvPicPr>
-                    <pic:cNvPr id="0" name="image5.png"/>
+                    <pic:cNvPr id="0" name="image7.png"/>
                     <pic:cNvPicPr preferRelativeResize="0"/>
                   </pic:nvPicPr>
                   <pic:blipFill>
@@ -12749,7 +14187,7 @@
                   <pic:spPr>
                     <a:xfrm>
                       <a:off x="0" y="0"/>
-                      <a:ext cx="3869647" cy="2770462"/>
+                      <a:ext cx="5750000" cy="3770805"/>
                     </a:xfrm>
                     <a:prstGeom prst="rect"/>
                     <a:ln/>
@@ -12786,6 +14224,26 @@
     </w:p>
     <w:p>
       <w:pPr>
+        <w:ind w:left="0" w:firstLine="708.6614173228347"/>
+        <w:rPr/>
+      </w:pPr>
+      <w:r>
+        <w:rPr>
+          <w:b w:val="1"/>
+          <w:bCs w:val="1"/>
+          <w:rtl w:val="0"/>
+        </w:rPr>
+        <w:t xml:space="preserve">Leitura:</w:t>
+      </w:r>
+      <w:r>
+        <w:rPr>
+          <w:rtl w:val="0"/>
+        </w:rPr>
+        <w:t xml:space="preserve"> Cobrança é abstrata e se especializa em Cobrança Avulsa, ligada a um Agendamento, e em Mensalidade, ligada a uma Recorrência. As Tentativas de Pagamento são partes da Cobrança (composição), e só uma tentativa confirmada pelo gateway gera o Pagamento que quita a Cobrança (RN-058, RN-077). Relaciona-se aos UC-041 a UC-043.</w:t>
+      </w:r>
+    </w:p>
+    <w:p>
+      <w:pPr>
         <w:keepNext w:val="1"/>
         <w:spacing w:after="120" w:before="120" w:line="240" w:lineRule="auto"/>
         <w:jc w:val="center"/>
@@ -12819,14 +14277,14 @@
         </w:rPr>
         <w:drawing>
           <wp:inline distB="114300" distT="114300" distL="114300" distR="114300">
-            <wp:extent cx="3867850" cy="2669136"/>
+            <wp:extent cx="5750000" cy="3081724"/>
             <wp:effectExtent b="0" l="0" r="0" t="0"/>
-            <wp:docPr id="3" name="image7.png"/>
+            <wp:docPr id="5" name="image4.png"/>
             <a:graphic>
               <a:graphicData uri="http://schemas.openxmlformats.org/drawingml/2006/picture">
                 <pic:pic>
                   <pic:nvPicPr>
-                    <pic:cNvPr id="0" name="image7.png"/>
+                    <pic:cNvPr id="0" name="image4.png"/>
                     <pic:cNvPicPr preferRelativeResize="0"/>
                   </pic:nvPicPr>
                   <pic:blipFill>
@@ -12839,7 +14297,7 @@
                   <pic:spPr>
                     <a:xfrm>
                       <a:off x="0" y="0"/>
-                      <a:ext cx="3867850" cy="2669136"/>
+                      <a:ext cx="5750000" cy="3081724"/>
                     </a:xfrm>
                     <a:prstGeom prst="rect"/>
                     <a:ln/>
@@ -12876,6 +14334,26 @@
     </w:p>
     <w:p>
       <w:pPr>
+        <w:ind w:left="0" w:firstLine="708.6614173228347"/>
+        <w:rPr/>
+      </w:pPr>
+      <w:r>
+        <w:rPr>
+          <w:b w:val="1"/>
+          <w:bCs w:val="1"/>
+          <w:rtl w:val="0"/>
+        </w:rPr>
+        <w:t xml:space="preserve">Leitura:</w:t>
+      </w:r>
+      <w:r>
+        <w:rPr>
+          <w:rtl w:val="0"/>
+        </w:rPr>
+        <w:t xml:space="preserve"> Cada Psicólogo pode ter uma Lista de Espera, composta pelas Inscrições dos Pacientes. Uma Inscrição recebe Ofertas de Encaixe com prazo de 24 horas, e uma oferta aceita, depois de nova verificação de disponibilidade, gera no máximo um Agendamento (RN-065, RN-067). Relaciona-se aos UC-044 a UC-047.</w:t>
+      </w:r>
+    </w:p>
+    <w:p>
+      <w:pPr>
         <w:keepNext w:val="1"/>
         <w:spacing w:after="120" w:before="120" w:line="240" w:lineRule="auto"/>
         <w:jc w:val="center"/>
@@ -12909,14 +14387,14 @@
         </w:rPr>
         <w:drawing>
           <wp:inline distB="114300" distT="114300" distL="114300" distR="114300">
-            <wp:extent cx="3811613" cy="2728913"/>
+            <wp:extent cx="5750000" cy="3342364"/>
             <wp:effectExtent b="0" l="0" r="0" t="0"/>
-            <wp:docPr id="6" name="image8.png"/>
+            <wp:docPr id="8" name="image5.png"/>
             <a:graphic>
               <a:graphicData uri="http://schemas.openxmlformats.org/drawingml/2006/picture">
                 <pic:pic>
                   <pic:nvPicPr>
-                    <pic:cNvPr id="0" name="image8.png"/>
+                    <pic:cNvPr id="0" name="image5.png"/>
                     <pic:cNvPicPr preferRelativeResize="0"/>
                   </pic:nvPicPr>
                   <pic:blipFill>
@@ -12929,7 +14407,7 @@
                   <pic:spPr>
                     <a:xfrm>
                       <a:off x="0" y="0"/>
-                      <a:ext cx="3811613" cy="2728913"/>
+                      <a:ext cx="5750000" cy="3342364"/>
                     </a:xfrm>
                     <a:prstGeom prst="rect"/>
                     <a:ln/>
@@ -12966,6 +14444,26 @@
     </w:p>
     <w:p>
       <w:pPr>
+        <w:ind w:left="0" w:firstLine="708.6614173228347"/>
+        <w:rPr/>
+      </w:pPr>
+      <w:r>
+        <w:rPr>
+          <w:b w:val="1"/>
+          <w:bCs w:val="1"/>
+          <w:rtl w:val="0"/>
+        </w:rPr>
+        <w:t xml:space="preserve">Leitura:</w:t>
+      </w:r>
+      <w:r>
+        <w:rPr>
+          <w:rtl w:val="0"/>
+        </w:rPr>
+        <w:t xml:space="preserve"> O Documento pertence a um Paciente e pode ter um Psicólogo responsável (0..1), já que documentos enviados pelo próprio Paciente não têm profissional. Cada Compartilhamento libera um Documento para um Destinatário específico, com finalidade, fundamento e validade, e é composto pelos Registros de Acesso usados na auditoria. Relaciona-se aos UC-020, UC-036, UC-048 e UC-049.</w:t>
+      </w:r>
+    </w:p>
+    <w:p>
+      <w:pPr>
         <w:keepNext w:val="1"/>
         <w:spacing w:after="120" w:before="120" w:line="240" w:lineRule="auto"/>
         <w:jc w:val="center"/>
@@ -12999,14 +14497,14 @@
         </w:rPr>
         <w:drawing>
           <wp:inline distB="114300" distT="114300" distL="114300" distR="114300">
-            <wp:extent cx="3816205" cy="2637112"/>
+            <wp:extent cx="5750000" cy="2852030"/>
             <wp:effectExtent b="0" l="0" r="0" t="0"/>
-            <wp:docPr id="4" name="image4.png"/>
+            <wp:docPr id="7" name="image8.png"/>
             <a:graphic>
               <a:graphicData uri="http://schemas.openxmlformats.org/drawingml/2006/picture">
                 <pic:pic>
                   <pic:nvPicPr>
-                    <pic:cNvPr id="0" name="image4.png"/>
+                    <pic:cNvPr id="0" name="image8.png"/>
                     <pic:cNvPicPr preferRelativeResize="0"/>
                   </pic:nvPicPr>
                   <pic:blipFill>
@@ -13019,7 +14517,7 @@
                   <pic:spPr>
                     <a:xfrm>
                       <a:off x="0" y="0"/>
-                      <a:ext cx="3816205" cy="2637112"/>
+                      <a:ext cx="5750000" cy="2852030"/>
                     </a:xfrm>
                     <a:prstGeom prst="rect"/>
                     <a:ln/>
@@ -13056,10 +14554,30 @@
     </w:p>
     <w:p>
       <w:pPr>
+        <w:ind w:left="0" w:firstLine="708.6614173228347"/>
+        <w:rPr/>
+      </w:pPr>
+      <w:r>
+        <w:rPr>
+          <w:b w:val="1"/>
+          <w:bCs w:val="1"/>
+          <w:rtl w:val="0"/>
+        </w:rPr>
+        <w:t xml:space="preserve">Leitura:</w:t>
+      </w:r>
+      <w:r>
+        <w:rPr>
+          <w:rtl w:val="0"/>
+        </w:rPr>
+        <w:t xml:space="preserve"> A Notificação vai para um Usuário ou para um Destinatário externo, nunca para os dois (restrição {xor}), e pode ter como contexto uma Oferta de Encaixe ou um Compartilhamento. O Registro de Auditoria é somente leitura e pode não ter autor quando a operação é automática (RF-023, RN-015). Relaciona-se ao UC-014 e aos RF-072 a RF-075.</w:t>
+      </w:r>
+    </w:p>
+    <w:p>
+      <w:pPr>
         <w:pStyle w:val="Heading1"/>
         <w:rPr/>
       </w:pPr>
-      <w:bookmarkStart w:colFirst="0" w:colLast="0" w:name="_aqo696i28ow3" w:id="28"/>
+      <w:bookmarkStart w:colFirst="0" w:colLast="0" w:name="_cp69guk0gw6h" w:id="28"/>
       <w:bookmarkEnd w:id="28"/>
       <w:r>
         <w:rPr>
@@ -13116,14 +14634,14 @@
         </w:rPr>
         <w:drawing>
           <wp:inline distB="114300" distT="114300" distL="114300" distR="114300">
-            <wp:extent cx="3586163" cy="1713906"/>
+            <wp:extent cx="5750000" cy="2755350"/>
             <wp:effectExtent b="0" l="0" r="0" t="0"/>
-            <wp:docPr id="10" name="image2.png"/>
+            <wp:docPr id="9" name="image1.png"/>
             <a:graphic>
               <a:graphicData uri="http://schemas.openxmlformats.org/drawingml/2006/picture">
                 <pic:pic>
                   <pic:nvPicPr>
-                    <pic:cNvPr id="0" name="image2.png"/>
+                    <pic:cNvPr id="0" name="image1.png"/>
                     <pic:cNvPicPr preferRelativeResize="0"/>
                   </pic:nvPicPr>
                   <pic:blipFill>
@@ -13136,7 +14654,7 @@
                   <pic:spPr>
                     <a:xfrm>
                       <a:off x="0" y="0"/>
-                      <a:ext cx="3586163" cy="1713906"/>
+                      <a:ext cx="5750000" cy="2755350"/>
                     </a:xfrm>
                     <a:prstGeom prst="rect"/>
                     <a:ln/>
@@ -13173,6 +14691,26 @@
     </w:p>
     <w:p>
       <w:pPr>
+        <w:ind w:left="0" w:firstLine="708.6614173228347"/>
+        <w:rPr/>
+      </w:pPr>
+      <w:r>
+        <w:rPr>
+          <w:b w:val="1"/>
+          <w:bCs w:val="1"/>
+          <w:rtl w:val="0"/>
+        </w:rPr>
+        <w:t xml:space="preserve">Leitura:</w:t>
+      </w:r>
+      <w:r>
+        <w:rPr>
+          <w:rtl w:val="0"/>
+        </w:rPr>
+        <w:t xml:space="preserve"> os objetos são instâncias das classes Psicólogo, Paciente, Agendamento e Disponibilidade. O agendamento consulta001 está na situação Agendada, um dos valores da enumeração SituaçãoAgendamento, e ocupa um horário contido na disponibilidade001 da psicóloga Ana. Os nomes são fictícios, como exige a restrição de não usar dados reais de pacientes.</w:t>
+      </w:r>
+    </w:p>
+    <w:p>
+      <w:pPr>
         <w:pStyle w:val="Heading1"/>
         <w:keepNext w:val="0"/>
         <w:keepLines w:val="0"/>
@@ -13182,7 +14720,7 @@
           <w:szCs w:val="24"/>
         </w:rPr>
       </w:pPr>
-      <w:bookmarkStart w:colFirst="0" w:colLast="0" w:name="_2vlqyxdgimnc" w:id="29"/>
+      <w:bookmarkStart w:colFirst="0" w:colLast="0" w:name="_fope1htl6oko" w:id="29"/>
       <w:bookmarkEnd w:id="29"/>
       <w:r>
         <w:rPr>
@@ -13206,7 +14744,7 @@
           <w:szCs w:val="24"/>
         </w:rPr>
       </w:pPr>
-      <w:bookmarkStart w:colFirst="0" w:colLast="0" w:name="_oymqaxeps8w4" w:id="30"/>
+      <w:bookmarkStart w:colFirst="0" w:colLast="0" w:name="_8a7r27j9z7s4" w:id="30"/>
       <w:bookmarkEnd w:id="30"/>
       <w:r>
         <w:rPr>
@@ -13245,7 +14783,7 @@
           <w:szCs w:val="24"/>
         </w:rPr>
       </w:pPr>
-      <w:bookmarkStart w:colFirst="0" w:colLast="0" w:name="_yxbl8ncmnn84" w:id="31"/>
+      <w:bookmarkStart w:colFirst="0" w:colLast="0" w:name="_ygd4kys5awvf" w:id="31"/>
       <w:bookmarkEnd w:id="31"/>
       <w:r>
         <w:rPr>
@@ -13461,7 +14999,7 @@
                 <w:szCs w:val="20"/>
                 <w:rtl w:val="0"/>
               </w:rPr>
-              <w:t xml:space="preserve">Paciente, Psicólogo e Agendamento representam conceitos essenciais do domínio e guardam só as características relevantes para a plataforma.</w:t>
+              <w:t xml:space="preserve">Paciente, Psicólogo e Agendamento representam conceitos essenciais do domínio e guardam só as características relevantes para a plataforma. Cobrança é abstrata: reúne o que toda cobrança tem e não é criada diretamente.</w:t>
             </w:r>
           </w:p>
         </w:tc>
@@ -13538,7 +15076,7 @@
                 <w:szCs w:val="20"/>
                 <w:rtl w:val="0"/>
               </w:rPr>
-              <w:t xml:space="preserve">Os atributos são privados (-) e as operações são públicas (+). Por exemplo, o atributo privado situação de Agendamento só muda pela operação alterarSituação().</w:t>
+              <w:t xml:space="preserve">Os atributos são privados (-) e só mudam por operações com significado de negócio. A situação do Agendamento muda por confirmar(), cancelar(), reagendar() ou registrarNãoComparecimento(), e não por um método genérico. A senha do Usuário existe apenas como senhaHash, e nenhuma operação a devolve.</w:t>
             </w:r>
           </w:p>
         </w:tc>
@@ -13769,7 +15307,7 @@
                 <w:szCs w:val="20"/>
                 <w:rtl w:val="0"/>
               </w:rPr>
-              <w:t xml:space="preserve">Não foi preciso generalizar Paciente, Psicólogo e Usuário. Compartilhar dados pessoais não basta para justificar herança.</w:t>
+              <w:t xml:space="preserve">Cobrança Avulsa e Mensalidade especializam Cobrança, porque ambas são, de fato, cobranças (relação "é um") e herdam valor, vencimento, situação e quitação. Paciente, Psicólogo e Usuário não foram generalizados: compartilhar dados pessoais não basta para justificar herança, e o Responsável é um papel, não um tipo de Usuário.</w:t>
             </w:r>
           </w:p>
         </w:tc>
@@ -13846,7 +15384,7 @@
                 <w:szCs w:val="20"/>
                 <w:rtl w:val="0"/>
               </w:rPr>
-              <w:t xml:space="preserve">Os diagramas não mostram operações polimórficas. O recurso pode ser avaliado se surgirem comportamentos comuns com implementações diferentes, sem criar hierarquias artificiais.</w:t>
+              <w:t xml:space="preserve">Cobrança declara a operação abstrata descreverReferência(), que Cobrança Avulsa (pela consulta de origem) e Mensalidade (pela competência da recorrência) implementam de formas diferentes. Quem trata uma Cobrança, como a consulta de cobranças do UC-041, não precisa saber de qual tipo ela é.</w:t>
             </w:r>
           </w:p>
         </w:tc>
@@ -13923,7 +15461,84 @@
                 <w:szCs w:val="20"/>
                 <w:rtl w:val="0"/>
               </w:rPr>
-              <w:t xml:space="preserve">Só se aplica quando há um todo e suas partes, com ciclo de vida dependente. Paciente, Psicólogo e Agendamento existem de forma independente, por isso suas associações não são composição.</w:t>
+              <w:t xml:space="preserve">Usada onde a parte não existe sem o todo: Versão da Evolução em Evolução Clínica, Tentativa de Pagamento em Cobrança, Inscrição em Lista de Espera e Registro de Acesso em Compartilhamento de Documento. Paciente, Psicólogo e Agendamento existem de forma independente, por isso suas associações não são composição.</w:t>
+            </w:r>
+          </w:p>
+        </w:tc>
+      </w:tr>
+      <w:tr>
+        <w:trPr>
+          <w:cantSplit w:val="0"/>
+          <w:trHeight w:val="735" w:hRule="atLeast"/>
+          <w:tblHeader w:val="0"/>
+        </w:trPr>
+        <w:tc>
+          <w:tcPr>
+            <w:tcBorders>
+              <w:top w:color="000000" w:space="0" w:sz="6" w:val="single"/>
+              <w:left w:color="000000" w:space="0" w:sz="6" w:val="single"/>
+              <w:bottom w:color="000000" w:space="0" w:sz="6" w:val="single"/>
+              <w:right w:color="000000" w:space="0" w:sz="6" w:val="single"/>
+            </w:tcBorders>
+            <w:tcMar>
+              <w:top w:w="60.0" w:type="dxa"/>
+              <w:left w:w="80.0" w:type="dxa"/>
+              <w:bottom w:w="60.0" w:type="dxa"/>
+              <w:right w:w="80.0" w:type="dxa"/>
+            </w:tcMar>
+            <w:vAlign w:val="top"/>
+          </w:tcPr>
+          <w:p>
+            <w:pPr>
+              <w:spacing w:after="0" w:line="240" w:lineRule="auto"/>
+              <w:jc w:val="left"/>
+              <w:rPr>
+                <w:sz w:val="20"/>
+                <w:szCs w:val="20"/>
+              </w:rPr>
+            </w:pPr>
+            <w:r>
+              <w:rPr>
+                <w:sz w:val="20"/>
+                <w:szCs w:val="20"/>
+                <w:rtl w:val="0"/>
+              </w:rPr>
+              <w:t xml:space="preserve">Agregação</w:t>
+            </w:r>
+          </w:p>
+        </w:tc>
+        <w:tc>
+          <w:tcPr>
+            <w:tcBorders>
+              <w:top w:color="000000" w:space="0" w:sz="6" w:val="single"/>
+              <w:left w:color="000000" w:space="0" w:sz="6" w:val="single"/>
+              <w:bottom w:color="000000" w:space="0" w:sz="6" w:val="single"/>
+              <w:right w:color="000000" w:space="0" w:sz="6" w:val="single"/>
+            </w:tcBorders>
+            <w:tcMar>
+              <w:top w:w="60.0" w:type="dxa"/>
+              <w:left w:w="80.0" w:type="dxa"/>
+              <w:bottom w:w="60.0" w:type="dxa"/>
+              <w:right w:w="80.0" w:type="dxa"/>
+            </w:tcMar>
+            <w:vAlign w:val="top"/>
+          </w:tcPr>
+          <w:p>
+            <w:pPr>
+              <w:spacing w:after="0" w:line="240" w:lineRule="auto"/>
+              <w:jc w:val="left"/>
+              <w:rPr>
+                <w:sz w:val="20"/>
+                <w:szCs w:val="20"/>
+              </w:rPr>
+            </w:pPr>
+            <w:r>
+              <w:rPr>
+                <w:sz w:val="20"/>
+                <w:szCs w:val="20"/>
+                <w:rtl w:val="0"/>
+              </w:rPr>
+              <w:t xml:space="preserve">Perfil de Acesso agrega Permissões: a mesma permissão pode fazer parte de vários perfis e continua existindo se um perfil deixar de usá-la.</w:t>
             </w:r>
           </w:p>
         </w:tc>
@@ -13960,7 +15575,7 @@
           <w:szCs w:val="24"/>
         </w:rPr>
       </w:pPr>
-      <w:bookmarkStart w:colFirst="0" w:colLast="0" w:name="_n4f2pansssc9" w:id="32"/>
+      <w:bookmarkStart w:colFirst="0" w:colLast="0" w:name="_c442par9g8ax" w:id="32"/>
       <w:bookmarkEnd w:id="32"/>
       <w:r>
         <w:rPr>
@@ -13988,15 +15603,14 @@
     </w:p>
     <w:p>
       <w:pPr>
-        <w:spacing w:after="0" w:lineRule="auto"/>
-        <w:ind w:firstLine="700"/>
+        <w:ind w:left="0" w:firstLine="708.6614173228347"/>
         <w:rPr/>
       </w:pPr>
       <w:r>
         <w:rPr>
           <w:rtl w:val="0"/>
         </w:rPr>
-        <w:t xml:space="preserve">Herança, polimorfismo e composição não foram usados por obrigação. Eles só entram quando há uma necessidade real no sistema, o que mantém o modelo consistente e sem complexidade desnecessária.</w:t>
+        <w:t xml:space="preserve">Herança, polimorfismo e composição foram usados só onde o domínio pede: a hierarquia de Cobrança tem uma relação "é um" real e um comportamento que varia por tipo, e as composições marcam partes que não existem sem o todo. Onde a relação "é um" não se sustenta, como entre Usuário, Paciente e Psicólogo, o modelo usa associação.</w:t>
       </w:r>
     </w:p>
     <w:p>
@@ -14010,7 +15624,7 @@
           <w:szCs w:val="24"/>
         </w:rPr>
       </w:pPr>
-      <w:bookmarkStart w:colFirst="0" w:colLast="0" w:name="_st9xnfv37kq3" w:id="33"/>
+      <w:bookmarkStart w:colFirst="0" w:colLast="0" w:name="_7f06x333icb" w:id="33"/>
       <w:bookmarkEnd w:id="33"/>
       <w:r>
         <w:rPr>
@@ -14034,7 +15648,7 @@
           <w:szCs w:val="24"/>
         </w:rPr>
       </w:pPr>
-      <w:bookmarkStart w:colFirst="0" w:colLast="0" w:name="_51s9u2dkgy8" w:id="34"/>
+      <w:bookmarkStart w:colFirst="0" w:colLast="0" w:name="_5k6jaxs39hh6" w:id="34"/>
       <w:bookmarkEnd w:id="34"/>
       <w:r>
         <w:rPr>
@@ -14073,7 +15687,7 @@
           <w:szCs w:val="24"/>
         </w:rPr>
       </w:pPr>
-      <w:bookmarkStart w:colFirst="0" w:colLast="0" w:name="_ycriplcdrwta" w:id="35"/>
+      <w:bookmarkStart w:colFirst="0" w:colLast="0" w:name="_3dge8vng7akf" w:id="35"/>
       <w:bookmarkEnd w:id="35"/>
       <w:r>
         <w:rPr>
@@ -14448,6 +16062,300 @@
           </w:p>
         </w:tc>
       </w:tr>
+      <w:tr>
+        <w:trPr>
+          <w:cantSplit w:val="0"/>
+          <w:trHeight w:val="1335" w:hRule="atLeast"/>
+          <w:tblHeader w:val="0"/>
+        </w:trPr>
+        <w:tc>
+          <w:tcPr>
+            <w:tcBorders>
+              <w:top w:color="000000" w:space="0" w:sz="6" w:val="single"/>
+              <w:left w:color="000000" w:space="0" w:sz="6" w:val="single"/>
+              <w:bottom w:color="000000" w:space="0" w:sz="6" w:val="single"/>
+              <w:right w:color="000000" w:space="0" w:sz="6" w:val="single"/>
+            </w:tcBorders>
+            <w:tcMar>
+              <w:top w:w="60.0" w:type="dxa"/>
+              <w:left w:w="80.0" w:type="dxa"/>
+              <w:bottom w:w="60.0" w:type="dxa"/>
+              <w:right w:w="80.0" w:type="dxa"/>
+            </w:tcMar>
+            <w:vAlign w:val="top"/>
+          </w:tcPr>
+          <w:p>
+            <w:pPr>
+              <w:spacing w:after="0" w:line="240" w:lineRule="auto"/>
+              <w:jc w:val="left"/>
+              <w:rPr>
+                <w:sz w:val="20"/>
+                <w:szCs w:val="20"/>
+              </w:rPr>
+            </w:pPr>
+            <w:r>
+              <w:rPr>
+                <w:sz w:val="20"/>
+                <w:szCs w:val="20"/>
+                <w:rtl w:val="0"/>
+              </w:rPr>
+              <w:t xml:space="preserve">OCP (Princípio Aberto/Fechado)</w:t>
+            </w:r>
+          </w:p>
+        </w:tc>
+        <w:tc>
+          <w:tcPr>
+            <w:tcBorders>
+              <w:top w:color="000000" w:space="0" w:sz="6" w:val="single"/>
+              <w:left w:color="000000" w:space="0" w:sz="6" w:val="single"/>
+              <w:bottom w:color="000000" w:space="0" w:sz="6" w:val="single"/>
+              <w:right w:color="000000" w:space="0" w:sz="6" w:val="single"/>
+            </w:tcBorders>
+            <w:tcMar>
+              <w:top w:w="60.0" w:type="dxa"/>
+              <w:left w:w="80.0" w:type="dxa"/>
+              <w:bottom w:w="60.0" w:type="dxa"/>
+              <w:right w:w="80.0" w:type="dxa"/>
+            </w:tcMar>
+            <w:vAlign w:val="top"/>
+          </w:tcPr>
+          <w:p>
+            <w:pPr>
+              <w:spacing w:after="0" w:line="240" w:lineRule="auto"/>
+              <w:jc w:val="left"/>
+              <w:rPr>
+                <w:sz w:val="20"/>
+                <w:szCs w:val="20"/>
+              </w:rPr>
+            </w:pPr>
+            <w:r>
+              <w:rPr>
+                <w:sz w:val="20"/>
+                <w:szCs w:val="20"/>
+                <w:rtl w:val="0"/>
+              </w:rPr>
+              <w:t xml:space="preserve">Cobrança é abstrata e concentra as regras comuns; um novo tipo de cobrança, como um pacote de sessões, entra como nova subclasse.</w:t>
+            </w:r>
+          </w:p>
+        </w:tc>
+        <w:tc>
+          <w:tcPr>
+            <w:tcBorders>
+              <w:top w:color="000000" w:space="0" w:sz="6" w:val="single"/>
+              <w:left w:color="000000" w:space="0" w:sz="6" w:val="single"/>
+              <w:bottom w:color="000000" w:space="0" w:sz="6" w:val="single"/>
+              <w:right w:color="000000" w:space="0" w:sz="6" w:val="single"/>
+            </w:tcBorders>
+            <w:tcMar>
+              <w:top w:w="60.0" w:type="dxa"/>
+              <w:left w:w="80.0" w:type="dxa"/>
+              <w:bottom w:w="60.0" w:type="dxa"/>
+              <w:right w:w="80.0" w:type="dxa"/>
+            </w:tcMar>
+            <w:vAlign w:val="top"/>
+          </w:tcPr>
+          <w:p>
+            <w:pPr>
+              <w:spacing w:after="0" w:line="240" w:lineRule="auto"/>
+              <w:jc w:val="left"/>
+              <w:rPr>
+                <w:sz w:val="20"/>
+                <w:szCs w:val="20"/>
+              </w:rPr>
+            </w:pPr>
+            <w:r>
+              <w:rPr>
+                <w:sz w:val="20"/>
+                <w:szCs w:val="20"/>
+                <w:rtl w:val="0"/>
+              </w:rPr>
+              <w:t xml:space="preserve">Evita alterar Cobrança e quem a usa a cada novo modelo de cobrança.</w:t>
+            </w:r>
+          </w:p>
+        </w:tc>
+        <w:tc>
+          <w:tcPr>
+            <w:tcBorders>
+              <w:top w:color="000000" w:space="0" w:sz="6" w:val="single"/>
+              <w:left w:color="000000" w:space="0" w:sz="6" w:val="single"/>
+              <w:bottom w:color="000000" w:space="0" w:sz="6" w:val="single"/>
+              <w:right w:color="000000" w:space="0" w:sz="6" w:val="single"/>
+            </w:tcBorders>
+            <w:tcMar>
+              <w:top w:w="60.0" w:type="dxa"/>
+              <w:left w:w="80.0" w:type="dxa"/>
+              <w:bottom w:w="60.0" w:type="dxa"/>
+              <w:right w:w="80.0" w:type="dxa"/>
+            </w:tcMar>
+            <w:vAlign w:val="top"/>
+          </w:tcPr>
+          <w:p>
+            <w:pPr>
+              <w:spacing w:after="0" w:line="240" w:lineRule="auto"/>
+              <w:jc w:val="left"/>
+              <w:rPr>
+                <w:sz w:val="20"/>
+                <w:szCs w:val="20"/>
+              </w:rPr>
+            </w:pPr>
+            <w:r>
+              <w:rPr>
+                <w:sz w:val="20"/>
+                <w:szCs w:val="20"/>
+                <w:rtl w:val="0"/>
+              </w:rPr>
+              <w:t xml:space="preserve">A quitação e a situação continuam em um só lugar.</w:t>
+            </w:r>
+          </w:p>
+        </w:tc>
+      </w:tr>
+      <w:tr>
+        <w:trPr>
+          <w:cantSplit w:val="0"/>
+          <w:trHeight w:val="1335" w:hRule="atLeast"/>
+          <w:tblHeader w:val="0"/>
+        </w:trPr>
+        <w:tc>
+          <w:tcPr>
+            <w:tcBorders>
+              <w:top w:color="000000" w:space="0" w:sz="6" w:val="single"/>
+              <w:left w:color="000000" w:space="0" w:sz="6" w:val="single"/>
+              <w:bottom w:color="000000" w:space="0" w:sz="6" w:val="single"/>
+              <w:right w:color="000000" w:space="0" w:sz="6" w:val="single"/>
+            </w:tcBorders>
+            <w:tcMar>
+              <w:top w:w="60.0" w:type="dxa"/>
+              <w:left w:w="80.0" w:type="dxa"/>
+              <w:bottom w:w="60.0" w:type="dxa"/>
+              <w:right w:w="80.0" w:type="dxa"/>
+            </w:tcMar>
+            <w:vAlign w:val="top"/>
+          </w:tcPr>
+          <w:p>
+            <w:pPr>
+              <w:spacing w:after="0" w:line="240" w:lineRule="auto"/>
+              <w:jc w:val="left"/>
+              <w:rPr>
+                <w:sz w:val="20"/>
+                <w:szCs w:val="20"/>
+              </w:rPr>
+            </w:pPr>
+            <w:r>
+              <w:rPr>
+                <w:sz w:val="20"/>
+                <w:szCs w:val="20"/>
+                <w:rtl w:val="0"/>
+              </w:rPr>
+              <w:t xml:space="preserve">LSP (Princípio da Substituição de Liskov)</w:t>
+            </w:r>
+          </w:p>
+        </w:tc>
+        <w:tc>
+          <w:tcPr>
+            <w:tcBorders>
+              <w:top w:color="000000" w:space="0" w:sz="6" w:val="single"/>
+              <w:left w:color="000000" w:space="0" w:sz="6" w:val="single"/>
+              <w:bottom w:color="000000" w:space="0" w:sz="6" w:val="single"/>
+              <w:right w:color="000000" w:space="0" w:sz="6" w:val="single"/>
+            </w:tcBorders>
+            <w:tcMar>
+              <w:top w:w="60.0" w:type="dxa"/>
+              <w:left w:w="80.0" w:type="dxa"/>
+              <w:bottom w:w="60.0" w:type="dxa"/>
+              <w:right w:w="80.0" w:type="dxa"/>
+            </w:tcMar>
+            <w:vAlign w:val="top"/>
+          </w:tcPr>
+          <w:p>
+            <w:pPr>
+              <w:spacing w:after="0" w:line="240" w:lineRule="auto"/>
+              <w:jc w:val="left"/>
+              <w:rPr>
+                <w:sz w:val="20"/>
+                <w:szCs w:val="20"/>
+              </w:rPr>
+            </w:pPr>
+            <w:r>
+              <w:rPr>
+                <w:sz w:val="20"/>
+                <w:szCs w:val="20"/>
+                <w:rtl w:val="0"/>
+              </w:rPr>
+              <w:t xml:space="preserve">Cobrança Avulsa e Mensalidade podem ser usadas onde se espera uma Cobrança, sem mudar quitação, cancelamento ou consulta.</w:t>
+            </w:r>
+          </w:p>
+        </w:tc>
+        <w:tc>
+          <w:tcPr>
+            <w:tcBorders>
+              <w:top w:color="000000" w:space="0" w:sz="6" w:val="single"/>
+              <w:left w:color="000000" w:space="0" w:sz="6" w:val="single"/>
+              <w:bottom w:color="000000" w:space="0" w:sz="6" w:val="single"/>
+              <w:right w:color="000000" w:space="0" w:sz="6" w:val="single"/>
+            </w:tcBorders>
+            <w:tcMar>
+              <w:top w:w="60.0" w:type="dxa"/>
+              <w:left w:w="80.0" w:type="dxa"/>
+              <w:bottom w:w="60.0" w:type="dxa"/>
+              <w:right w:w="80.0" w:type="dxa"/>
+            </w:tcMar>
+            <w:vAlign w:val="top"/>
+          </w:tcPr>
+          <w:p>
+            <w:pPr>
+              <w:spacing w:after="0" w:line="240" w:lineRule="auto"/>
+              <w:jc w:val="left"/>
+              <w:rPr>
+                <w:sz w:val="20"/>
+                <w:szCs w:val="20"/>
+              </w:rPr>
+            </w:pPr>
+            <w:r>
+              <w:rPr>
+                <w:sz w:val="20"/>
+                <w:szCs w:val="20"/>
+                <w:rtl w:val="0"/>
+              </w:rPr>
+              <w:t xml:space="preserve">Evita subclasses que quebram o contrato da classe base.</w:t>
+            </w:r>
+          </w:p>
+        </w:tc>
+        <w:tc>
+          <w:tcPr>
+            <w:tcBorders>
+              <w:top w:color="000000" w:space="0" w:sz="6" w:val="single"/>
+              <w:left w:color="000000" w:space="0" w:sz="6" w:val="single"/>
+              <w:bottom w:color="000000" w:space="0" w:sz="6" w:val="single"/>
+              <w:right w:color="000000" w:space="0" w:sz="6" w:val="single"/>
+            </w:tcBorders>
+            <w:tcMar>
+              <w:top w:w="60.0" w:type="dxa"/>
+              <w:left w:w="80.0" w:type="dxa"/>
+              <w:bottom w:w="60.0" w:type="dxa"/>
+              <w:right w:w="80.0" w:type="dxa"/>
+            </w:tcMar>
+            <w:vAlign w:val="top"/>
+          </w:tcPr>
+          <w:p>
+            <w:pPr>
+              <w:spacing w:after="0" w:line="240" w:lineRule="auto"/>
+              <w:jc w:val="left"/>
+              <w:rPr>
+                <w:sz w:val="20"/>
+                <w:szCs w:val="20"/>
+              </w:rPr>
+            </w:pPr>
+            <w:r>
+              <w:rPr>
+                <w:sz w:val="20"/>
+                <w:szCs w:val="20"/>
+                <w:rtl w:val="0"/>
+              </w:rPr>
+              <w:t xml:space="preserve">As subclasses só acrescentam dados e implementam descreverReferência(); não restringem as operações herdadas.</w:t>
+            </w:r>
+          </w:p>
+        </w:tc>
+      </w:tr>
     </w:tbl>
     <w:p>
       <w:pPr>
@@ -14469,28 +16377,26 @@
     </w:p>
     <w:p>
       <w:pPr>
-        <w:spacing w:after="0" w:lineRule="auto"/>
-        <w:ind w:firstLine="700"/>
+        <w:ind w:left="0" w:firstLine="708.6614173228347"/>
         <w:rPr/>
       </w:pPr>
       <w:r>
         <w:rPr>
           <w:rtl w:val="0"/>
         </w:rPr>
-        <w:t xml:space="preserve">O SRP aparece na distribuição de responsabilidades da seção 3.3 e no diagrama de classes da seção 4.</w:t>
+        <w:t xml:space="preserve">O SRP aparece na distribuição de responsabilidades da seção 3.3, e o OCP e o LSP aparecem na hierarquia de Cobrança do diagrama de classes (Figura 6).</w:t>
       </w:r>
     </w:p>
     <w:p>
       <w:pPr>
-        <w:spacing w:after="0" w:lineRule="auto"/>
-        <w:ind w:firstLine="700"/>
+        <w:ind w:left="0" w:firstLine="708.6614173228347"/>
         <w:rPr/>
       </w:pPr>
       <w:r>
         <w:rPr>
           <w:rtl w:val="0"/>
         </w:rPr>
-        <w:t xml:space="preserve">Os demais princípios SOLID não foram incluídos porque o modelo ainda não traz evidências da sua aplicação:</w:t>
+        <w:t xml:space="preserve">ISP e DIP dependem de interfaces e de abstrações de dependência, que fazem parte da arquitetura, e não do modelo de domínio:</w:t>
       </w:r>
     </w:p>
     <w:p>
@@ -14500,14 +16406,15 @@
           <w:numId w:val="1"/>
         </w:numPr>
         <w:pBdr>
-          <w:top w:color="auto" w:space="0" w:sz="0" w:val="none"/>
-          <w:bottom w:color="auto" w:space="0" w:sz="0" w:val="none"/>
-          <w:right w:color="auto" w:space="0" w:sz="0" w:val="none"/>
-          <w:between w:color="auto" w:space="0" w:sz="0" w:val="none"/>
+          <w:top w:color="000000" w:space="0" w:sz="0" w:val="none"/>
+          <w:bottom w:color="000000" w:space="0" w:sz="0" w:val="none"/>
+          <w:right w:color="000000" w:space="0" w:sz="0" w:val="none"/>
+          <w:between w:color="000000" w:space="0" w:sz="0" w:val="none"/>
         </w:pBdr>
         <w:spacing w:after="0" w:lineRule="auto"/>
         <w:ind w:left="720" w:hanging="360"/>
         <w:jc w:val="left"/>
+        <w:rPr/>
       </w:pPr>
       <w:r>
         <w:rPr>
@@ -14515,13 +16422,13 @@
           <w:bCs w:val="1"/>
           <w:rtl w:val="0"/>
         </w:rPr>
-        <w:t xml:space="preserve">OCP:</w:t>
-      </w:r>
-      <w:r>
-        <w:rPr>
-          <w:rtl w:val="0"/>
-        </w:rPr>
-        <w:t xml:space="preserve"> não há um mecanismo para estender comportamentos sem alterar as classes existentes.</w:t>
+        <w:t xml:space="preserve">ISP:</w:t>
+      </w:r>
+      <w:r>
+        <w:rPr>
+          <w:rtl w:val="0"/>
+        </w:rPr>
+        <w:t xml:space="preserve"> será aplicado no diagrama de componentes, com interfaces separadas para autenticação externa, pagamento e notificação, cada uma só com as operações de que o Nexo precisa.</w:t>
       </w:r>
     </w:p>
     <w:p>
@@ -14531,14 +16438,15 @@
           <w:numId w:val="1"/>
         </w:numPr>
         <w:pBdr>
-          <w:top w:color="auto" w:space="0" w:sz="0" w:val="none"/>
-          <w:bottom w:color="auto" w:space="0" w:sz="0" w:val="none"/>
-          <w:right w:color="auto" w:space="0" w:sz="0" w:val="none"/>
-          <w:between w:color="auto" w:space="0" w:sz="0" w:val="none"/>
+          <w:top w:color="000000" w:space="0" w:sz="0" w:val="none"/>
+          <w:bottom w:color="000000" w:space="0" w:sz="0" w:val="none"/>
+          <w:right w:color="000000" w:space="0" w:sz="0" w:val="none"/>
+          <w:between w:color="000000" w:space="0" w:sz="0" w:val="none"/>
         </w:pBdr>
         <w:spacing w:after="0" w:lineRule="auto"/>
         <w:ind w:left="720" w:hanging="360"/>
         <w:jc w:val="left"/>
+        <w:rPr/>
       </w:pPr>
       <w:r>
         <w:rPr>
@@ -14546,88 +16454,25 @@
           <w:bCs w:val="1"/>
           <w:rtl w:val="0"/>
         </w:rPr>
-        <w:t xml:space="preserve">LSP:</w:t>
-      </w:r>
-      <w:r>
-        <w:rPr>
-          <w:rtl w:val="0"/>
-        </w:rPr>
-        <w:t xml:space="preserve"> não há hierarquia de herança para avaliar a substituição entre tipos.</w:t>
+        <w:t xml:space="preserve">DIP:</w:t>
+      </w:r>
+      <w:r>
+        <w:rPr>
+          <w:rtl w:val="0"/>
+        </w:rPr>
+        <w:t xml:space="preserve"> as regras de negócio vão depender dessas interfaces, e não dos serviços externos concretos, o que também será demonstrado no diagrama de componentes.</w:t>
       </w:r>
     </w:p>
     <w:p>
       <w:pPr>
-        <w:numPr>
-          <w:ilvl w:val="0"/>
-          <w:numId w:val="1"/>
-        </w:numPr>
-        <w:pBdr>
-          <w:top w:color="auto" w:space="0" w:sz="0" w:val="none"/>
-          <w:bottom w:color="auto" w:space="0" w:sz="0" w:val="none"/>
-          <w:right w:color="auto" w:space="0" w:sz="0" w:val="none"/>
-          <w:between w:color="auto" w:space="0" w:sz="0" w:val="none"/>
-        </w:pBdr>
-        <w:spacing w:after="0" w:lineRule="auto"/>
-        <w:ind w:left="720" w:hanging="360"/>
-        <w:jc w:val="left"/>
-      </w:pPr>
-      <w:r>
-        <w:rPr>
-          <w:b w:val="1"/>
-          <w:bCs w:val="1"/>
-          <w:rtl w:val="0"/>
-        </w:rPr>
-        <w:t xml:space="preserve">ISP:</w:t>
-      </w:r>
-      <w:r>
-        <w:rPr>
-          <w:rtl w:val="0"/>
-        </w:rPr>
-        <w:t xml:space="preserve"> não há interfaces separadas por responsabilidade.</w:t>
-      </w:r>
-    </w:p>
-    <w:p>
-      <w:pPr>
-        <w:numPr>
-          <w:ilvl w:val="0"/>
-          <w:numId w:val="1"/>
-        </w:numPr>
-        <w:pBdr>
-          <w:top w:color="auto" w:space="0" w:sz="0" w:val="none"/>
-          <w:bottom w:color="auto" w:space="0" w:sz="0" w:val="none"/>
-          <w:right w:color="auto" w:space="0" w:sz="0" w:val="none"/>
-          <w:between w:color="auto" w:space="0" w:sz="0" w:val="none"/>
-        </w:pBdr>
-        <w:spacing w:after="0" w:lineRule="auto"/>
-        <w:ind w:left="720" w:hanging="360"/>
-        <w:jc w:val="left"/>
-      </w:pPr>
-      <w:r>
-        <w:rPr>
-          <w:b w:val="1"/>
-          <w:bCs w:val="1"/>
-          <w:rtl w:val="0"/>
-        </w:rPr>
-        <w:t xml:space="preserve">DIP:</w:t>
-      </w:r>
-      <w:r>
-        <w:rPr>
-          <w:rtl w:val="0"/>
-        </w:rPr>
-        <w:t xml:space="preserve"> não há abstrações de dependência que comprovem a inversão de dependências.</w:t>
-      </w:r>
-    </w:p>
-    <w:p>
-      <w:pPr>
-        <w:spacing w:after="0" w:lineRule="auto"/>
-        <w:ind w:firstLine="700"/>
+        <w:ind w:left="0" w:firstLine="708.6614173228347"/>
         <w:rPr/>
       </w:pPr>
       <w:r>
         <w:rPr>
           <w:rtl w:val="0"/>
         </w:rPr>
-        <w:t xml:space="preserve">Isso não quer dizer que esses princípios não caibam no Nexo, apenas que não faz sentido afirmar seu uso sem evidência no modelo.</w:t>
+        <w:t xml:space="preserve">Por isso, este documento registra como aplicados apenas os princípios que já têm evidência no diagrama de classes: SRP, OCP e LSP.</w:t>
       </w:r>
     </w:p>
     <w:p>
@@ -14643,7 +16488,7 @@
           <w:szCs w:val="24"/>
         </w:rPr>
       </w:pPr>
-      <w:bookmarkStart w:colFirst="0" w:colLast="0" w:name="_3spabaq64h30" w:id="36"/>
+      <w:bookmarkStart w:colFirst="0" w:colLast="0" w:name="_bp0t0qa48ifl" w:id="36"/>
       <w:bookmarkEnd w:id="36"/>
       <w:r>
         <w:rPr>
@@ -14658,28 +16503,26 @@
     </w:p>
     <w:p>
       <w:pPr>
-        <w:spacing w:after="0" w:lineRule="auto"/>
-        <w:ind w:firstLine="700"/>
+        <w:ind w:left="0" w:firstLine="708.6614173228347"/>
         <w:rPr/>
       </w:pPr>
       <w:r>
         <w:rPr>
           <w:rtl w:val="0"/>
         </w:rPr>
-        <w:t xml:space="preserve">Até aqui, os diagramas não mostram o uso comprovado de nenhum padrão de projeto. A separação entre Cobrança, Pagamento e Tentativa de Pagamento organiza bem as responsabilidades, mas não é, por si só, um padrão GoF.</w:t>
+        <w:t xml:space="preserve">O modelo de domínio não usa padrões GoF, e nenhum foi registrado sem evidência. O padrão State foi considerado para o Agendamento e descartado nesta etapa: as transições ficam em operações específicas (confirmar(), cancelar(), reagendar(), registrarRealização() e registrarNãoComparecimento()), com os valores definidos pela enumeração SituaçãoAgendamento, o que basta para as regras atuais sem criar uma classe por estado.</w:t>
       </w:r>
     </w:p>
     <w:p>
       <w:pPr>
-        <w:spacing w:after="0" w:lineRule="auto"/>
-        <w:ind w:firstLine="700"/>
+        <w:ind w:left="0" w:firstLine="708.6614173228347"/>
         <w:rPr/>
       </w:pPr>
       <w:r>
         <w:rPr>
           <w:rtl w:val="0"/>
         </w:rPr>
-        <w:t xml:space="preserve">Da mesma forma, as várias situações de um Agendamento não comprovam o padrão State, já que o modelo usa o atributo situação: String e operações que alteram seu valor, sem classes de estado. Por isso, nenhum padrão foi registrado sem evidência.</w:t>
+        <w:t xml:space="preserve">A hierarquia de Cobrança usa polimorfismo, mas não chega a ser um Template Method nem um Strategy. Padrões como Adapter, para isolar o gateway de pagamento, e Observer, para disparar notificações a partir de eventos da agenda, pertencem à arquitetura e serão avaliados no diagrama de componentes.</w:t>
       </w:r>
     </w:p>
     <w:sectPr>
@@ -15335,7 +17178,12 @@
     <w:tblPr>
       <w:tblStyleRowBandSize w:val="1"/>
       <w:tblStyleColBandSize w:val="1"/>
-      <w:tblCellMar/>
+      <w:tblCellMar>
+        <w:top w:w="100.0" w:type="dxa"/>
+        <w:left w:w="100.0" w:type="dxa"/>
+        <w:bottom w:w="100.0" w:type="dxa"/>
+        <w:right w:w="100.0" w:type="dxa"/>
+      </w:tblCellMar>
     </w:tblPr>
   </w:style>
   <w:style w:type="table" w:styleId="Table2">
@@ -15343,7 +17191,12 @@
     <w:tblPr>
       <w:tblStyleRowBandSize w:val="1"/>
       <w:tblStyleColBandSize w:val="1"/>
-      <w:tblCellMar/>
+      <w:tblCellMar>
+        <w:top w:w="100.0" w:type="dxa"/>
+        <w:left w:w="100.0" w:type="dxa"/>
+        <w:bottom w:w="100.0" w:type="dxa"/>
+        <w:right w:w="100.0" w:type="dxa"/>
+      </w:tblCellMar>
     </w:tblPr>
   </w:style>
   <w:style w:type="table" w:styleId="Table3">
@@ -15351,7 +17204,12 @@
     <w:tblPr>
       <w:tblStyleRowBandSize w:val="1"/>
       <w:tblStyleColBandSize w:val="1"/>
-      <w:tblCellMar/>
+      <w:tblCellMar>
+        <w:top w:w="100.0" w:type="dxa"/>
+        <w:left w:w="100.0" w:type="dxa"/>
+        <w:bottom w:w="100.0" w:type="dxa"/>
+        <w:right w:w="100.0" w:type="dxa"/>
+      </w:tblCellMar>
     </w:tblPr>
   </w:style>
   <w:style w:type="table" w:styleId="Table4">
@@ -15359,7 +17217,12 @@
     <w:tblPr>
       <w:tblStyleRowBandSize w:val="1"/>
       <w:tblStyleColBandSize w:val="1"/>
-      <w:tblCellMar/>
+      <w:tblCellMar>
+        <w:top w:w="100.0" w:type="dxa"/>
+        <w:left w:w="100.0" w:type="dxa"/>
+        <w:bottom w:w="100.0" w:type="dxa"/>
+        <w:right w:w="100.0" w:type="dxa"/>
+      </w:tblCellMar>
     </w:tblPr>
   </w:style>
   <w:style w:type="table" w:styleId="Table5">
@@ -15367,7 +17230,12 @@
     <w:tblPr>
       <w:tblStyleRowBandSize w:val="1"/>
       <w:tblStyleColBandSize w:val="1"/>
-      <w:tblCellMar/>
+      <w:tblCellMar>
+        <w:top w:w="100.0" w:type="dxa"/>
+        <w:left w:w="100.0" w:type="dxa"/>
+        <w:bottom w:w="100.0" w:type="dxa"/>
+        <w:right w:w="100.0" w:type="dxa"/>
+      </w:tblCellMar>
     </w:tblPr>
   </w:style>
   <w:style w:type="table" w:styleId="Table6">
@@ -15375,7 +17243,12 @@
     <w:tblPr>
       <w:tblStyleRowBandSize w:val="1"/>
       <w:tblStyleColBandSize w:val="1"/>
-      <w:tblCellMar/>
+      <w:tblCellMar>
+        <w:top w:w="100.0" w:type="dxa"/>
+        <w:left w:w="100.0" w:type="dxa"/>
+        <w:bottom w:w="100.0" w:type="dxa"/>
+        <w:right w:w="100.0" w:type="dxa"/>
+      </w:tblCellMar>
     </w:tblPr>
   </w:style>
   <w:style w:type="table" w:styleId="Table7">
@@ -15383,7 +17256,12 @@
     <w:tblPr>
       <w:tblStyleRowBandSize w:val="1"/>
       <w:tblStyleColBandSize w:val="1"/>
-      <w:tblCellMar/>
+      <w:tblCellMar>
+        <w:top w:w="100.0" w:type="dxa"/>
+        <w:left w:w="100.0" w:type="dxa"/>
+        <w:bottom w:w="100.0" w:type="dxa"/>
+        <w:right w:w="100.0" w:type="dxa"/>
+      </w:tblCellMar>
     </w:tblPr>
   </w:style>
   <w:style w:type="table" w:styleId="Table8">
@@ -15391,7 +17269,12 @@
     <w:tblPr>
       <w:tblStyleRowBandSize w:val="1"/>
       <w:tblStyleColBandSize w:val="1"/>
-      <w:tblCellMar/>
+      <w:tblCellMar>
+        <w:top w:w="100.0" w:type="dxa"/>
+        <w:left w:w="100.0" w:type="dxa"/>
+        <w:bottom w:w="100.0" w:type="dxa"/>
+        <w:right w:w="100.0" w:type="dxa"/>
+      </w:tblCellMar>
     </w:tblPr>
   </w:style>
   <w:style w:type="table" w:styleId="Table9">
@@ -15399,7 +17282,12 @@
     <w:tblPr>
       <w:tblStyleRowBandSize w:val="1"/>
       <w:tblStyleColBandSize w:val="1"/>
-      <w:tblCellMar/>
+      <w:tblCellMar>
+        <w:top w:w="100.0" w:type="dxa"/>
+        <w:left w:w="100.0" w:type="dxa"/>
+        <w:bottom w:w="100.0" w:type="dxa"/>
+        <w:right w:w="100.0" w:type="dxa"/>
+      </w:tblCellMar>
     </w:tblPr>
   </w:style>
   <w:style w:type="table" w:styleId="Table10">
@@ -15407,7 +17295,12 @@
     <w:tblPr>
       <w:tblStyleRowBandSize w:val="1"/>
       <w:tblStyleColBandSize w:val="1"/>
-      <w:tblCellMar/>
+      <w:tblCellMar>
+        <w:top w:w="100.0" w:type="dxa"/>
+        <w:left w:w="100.0" w:type="dxa"/>
+        <w:bottom w:w="100.0" w:type="dxa"/>
+        <w:right w:w="100.0" w:type="dxa"/>
+      </w:tblCellMar>
     </w:tblPr>
   </w:style>
   <w:style w:type="table" w:styleId="Table11">
@@ -15415,7 +17308,12 @@
     <w:tblPr>
       <w:tblStyleRowBandSize w:val="1"/>
       <w:tblStyleColBandSize w:val="1"/>
-      <w:tblCellMar/>
+      <w:tblCellMar>
+        <w:top w:w="100.0" w:type="dxa"/>
+        <w:left w:w="100.0" w:type="dxa"/>
+        <w:bottom w:w="100.0" w:type="dxa"/>
+        <w:right w:w="100.0" w:type="dxa"/>
+      </w:tblCellMar>
     </w:tblPr>
   </w:style>
   <w:style w:type="table" w:styleId="Table12">
@@ -15423,7 +17321,12 @@
     <w:tblPr>
       <w:tblStyleRowBandSize w:val="1"/>
       <w:tblStyleColBandSize w:val="1"/>
-      <w:tblCellMar/>
+      <w:tblCellMar>
+        <w:top w:w="100.0" w:type="dxa"/>
+        <w:left w:w="100.0" w:type="dxa"/>
+        <w:bottom w:w="100.0" w:type="dxa"/>
+        <w:right w:w="100.0" w:type="dxa"/>
+      </w:tblCellMar>
     </w:tblPr>
   </w:style>
 </w:styles>

</xml_diff>